<commit_message>
docs: rewrite report in a natural student voice
</commit_message>
<xml_diff>
--- a/submission/BUFS_Admissions_RAG_결과보고서_20232829.docx
+++ b/submission/BUFS_Admissions_RAG_결과보고서_20232829.docx
@@ -4,12 +4,12 @@
   <w:body>
     <w:p>
       <w:pPr>
-        <w:spacing w:after="1440"/>
+        <w:spacing w:after="1760"/>
       </w:pPr>
     </w:p>
     <w:p>
       <w:pPr>
-        <w:spacing w:after="360"/>
+        <w:spacing w:after="320"/>
         <w:jc w:val="center"/>
       </w:pPr>
       <w:r>
@@ -17,9 +17,9 @@
           <w:rFonts w:ascii="Calibri" w:hAnsi="Calibri" w:eastAsia="Malgun Gothic"/>
           <w:b/>
           <w:color w:val="A66F00"/>
-          <w:sz w:val="21"/>
+          <w:sz w:val="22"/>
         </w:rPr>
-        <w:t>MULTILINGUAL AI SERVICE · FINAL PROJECT</w:t>
+        <w:t>프로젝트 결과보고서</w:t>
       </w:r>
     </w:p>
     <w:p>
@@ -37,22 +37,22 @@
         <w:jc w:val="center"/>
       </w:pPr>
       <w:r>
-        <w:t>LangChain &amp; RAG 기반 외국인 지원자 맞춤형 입학 안내 서비스</w:t>
+        <w:t>공식 입학 문서를 근거로 답하는 LangChain·RAG 서비스</w:t>
       </w:r>
     </w:p>
     <w:p>
       <w:pPr>
-        <w:spacing w:after="1080"/>
+        <w:spacing w:after="1160"/>
+        <w:ind w:left="936" w:right="936"/>
         <w:jc w:val="center"/>
       </w:pPr>
       <w:r>
         <w:rPr>
           <w:rFonts w:ascii="Calibri" w:hAnsi="Calibri" w:eastAsia="Malgun Gothic"/>
-          <w:i/>
           <w:color w:val="66717D"/>
-          <w:sz w:val="20"/>
+          <w:sz w:val="21"/>
         </w:rPr>
-        <w:t>Official documents → semantic retrieval → grounded multilingual answers</w:t>
+        <w:t>외국인 지원자가 입학 서류와 일정을 자신의 언어로 쉽게 확인할 수 있도록 만든 웹 서비스</w:t>
       </w:r>
     </w:p>
     <w:p>
@@ -159,7 +159,7 @@
           <w:color w:val="66717D"/>
           <w:sz w:val="21"/>
         </w:rPr>
-        <w:t xml:space="preserve">Web  </w:t>
+        <w:t xml:space="preserve">배포 URL  </w:t>
       </w:r>
       <w:r>
         <w:rPr>
@@ -181,7 +181,7 @@
           <w:color w:val="66717D"/>
           <w:sz w:val="20"/>
         </w:rPr>
-        <w:t>부산외국어대학교 · 첨단산업 인재양성 AI 부트캠프</w:t>
+        <w:t>부산외국어대학교 AI 부트캠프</w:t>
       </w:r>
     </w:p>
     <w:p>
@@ -194,39 +194,17 @@
         <w:pStyle w:val="Heading1"/>
       </w:pPr>
       <w:r>
-        <w:t>1. 프로젝트 개요</w:t>
-      </w:r>
-    </w:p>
-    <w:p>
-      <w:pPr>
-        <w:spacing w:before="100" w:after="240" w:line="276" w:lineRule="auto"/>
-        <w:ind w:left="259" w:right="173"/>
-        <w:shd w:fill="EEF5FB"/>
-        <w:pBdr>
-          <w:left w:val="single" w:sz="18" w:space="10" w:color="2E74B5"/>
-        </w:pBdr>
-      </w:pPr>
-      <w:r>
-        <w:rPr>
-          <w:rFonts w:ascii="Calibri" w:hAnsi="Calibri" w:eastAsia="Malgun Gothic"/>
-          <w:b/>
-          <w:color w:val="1F4D78"/>
-          <w:sz w:val="22"/>
-        </w:rPr>
-        <w:t xml:space="preserve">핵심 성과  </w:t>
-      </w:r>
-      <w:r>
-        <w:rPr>
-          <w:rFonts w:ascii="Calibri" w:hAnsi="Calibri" w:eastAsia="Malgun Gothic"/>
-          <w:color w:val="222222"/>
-          <w:sz w:val="22"/>
-        </w:rPr>
-        <w:t>한국어·영어 공식 입학 문서 6개를 64개 검색 단위로 구축하고, 질문 언어를 유지한 근거 기반 Q&amp;A와 개인화 제출서류 체크리스트를 하나의 Streamlit 서비스로 구현했다.</w:t>
+        <w:t>1. 프로젝트를 시작한 이유</w:t>
       </w:r>
     </w:p>
     <w:p>
       <w:r>
-        <w:t>외국인 지원자는 모집요강, 온라인 접수 안내, 제출서류 체크리스트에 흩어진 정보를 여러 언어로 이해해야 한다. 일반 번역기는 문장을 바꾸는 데 그치며, 지원 과정과 신입·편입 여부에 따라 필요한 정보를 찾아 조합하고 공식 근거를 제시하지 못한다. 본 프로젝트는 RAG로 이 문제를 해결한다.</w:t>
+        <w:t>부산외대에는 한국어가 익숙하지 않은 외국인 지원자가 많다. 입학 관련 자료는 한국어와 영어 PDF로 나뉘어 있고, 모집요강 안에서도 마감일·지원 자격·제출 서류가 여러 페이지에 흩어져 있다. 필요한 내용을 찾으려면 문서를 하나씩 열어 봐야 해서 처음 지원하는 학생에게는 불편할 수 있다고 생각했다.</w:t>
+      </w:r>
+    </w:p>
+    <w:p>
+      <w:r>
+        <w:t>그래서 단순히 문장을 번역하는 서비스보다, 공식 문서에서 질문과 관련된 부분을 먼저 찾고 그 근거를 보여 주는 도구를 만들기로 했다. 특히 '무슨 서류를 준비해야 하는가'는 지원자의 과정과 신입·편입 여부에 따라 달라지므로, 일반 질문 답변과 별도로 체크리스트 기능도 넣었다.</w:t>
       </w:r>
     </w:p>
     <w:p>
@@ -234,7 +212,7 @@
         <w:pStyle w:val="Heading2"/>
       </w:pPr>
       <w:r>
-        <w:t>1.1 목표</w:t>
+        <w:t>1.1 만들고 싶었던 기능</w:t>
       </w:r>
     </w:p>
     <w:p>
@@ -243,7 +221,7 @@
         <w:ind w:left="720" w:hanging="360"/>
       </w:pPr>
       <w:r>
-        <w:t>사용자가 한국어, 영어, 중국어, 베트남어 등 원하는 언어로 질문할 수 있게 한다.</w:t>
+        <w:t>질문은 한국어·영어뿐 아니라 중국어와 베트남어 등 다른 언어로도 입력할 수 있게 한다.</w:t>
       </w:r>
     </w:p>
     <w:p>
@@ -252,7 +230,7 @@
         <w:ind w:left="720" w:hanging="360"/>
       </w:pPr>
       <w:r>
-        <w:t>답변을 공식 BUFS 입학 문서의 파일명과 페이지에 연결하여 검증 가능하게 한다.</w:t>
+        <w:t>답변에는 참고한 PDF 파일명과 페이지를 함께 표시한다.</w:t>
       </w:r>
     </w:p>
     <w:p>
@@ -261,7 +239,7 @@
         <w:ind w:left="720" w:hanging="360"/>
       </w:pPr>
       <w:r>
-        <w:t>지원 과정과 지원 유형을 반영한 제출서류 체크리스트를 자동 생성한다.</w:t>
+        <w:t>학부/대학원과 신입/편입 조건을 반영한 제출서류 목록을 만든다.</w:t>
       </w:r>
     </w:p>
     <w:p>
@@ -270,7 +248,7 @@
         <w:ind w:left="720" w:hanging="360"/>
       </w:pPr>
       <w:r>
-        <w:t>근거가 없으면 추측하지 않고 입학처 확인을 안내하는 안전장치를 제공한다.</w:t>
+        <w:t>문서에서 찾지 못한 내용은 추측하지 않고 입학처 확인을 안내한다.</w:t>
       </w:r>
     </w:p>
     <w:p>
@@ -278,7 +256,7 @@
         <w:pStyle w:val="Heading2"/>
       </w:pPr>
       <w:r>
-        <w:t>1.2 구현 범위 및 성과</w:t>
+        <w:t>1.2 프로젝트 한눈에 보기</w:t>
       </w:r>
     </w:p>
     <w:tbl>
@@ -329,7 +307,7 @@
                 <w:color w:val="203748"/>
                 <w:sz w:val="19"/>
               </w:rPr>
-              <w:t>구분</w:t>
+              <w:t>항목</w:t>
             </w:r>
           </w:p>
         </w:tc>
@@ -357,7 +335,7 @@
                 <w:color w:val="203748"/>
                 <w:sz w:val="19"/>
               </w:rPr>
-              <w:t>구현 결과</w:t>
+              <w:t>내용</w:t>
             </w:r>
           </w:p>
         </w:tc>
@@ -379,7 +357,7 @@
                 <w:color w:val="222222"/>
                 <w:sz w:val="18"/>
               </w:rPr>
-              <w:t>데이터</w:t>
+              <w:t>사용 문서</w:t>
             </w:r>
           </w:p>
         </w:tc>
@@ -399,7 +377,7 @@
                 <w:color w:val="222222"/>
                 <w:sz w:val="18"/>
               </w:rPr>
-              <w:t>BUFS 공식 입학 PDF 6개 · 한국어/영어</w:t>
+              <w:t>BUFS 공식 입학 관련 PDF 6개(한국어·영어)</w:t>
             </w:r>
           </w:p>
         </w:tc>
@@ -421,7 +399,7 @@
                 <w:color w:val="222222"/>
                 <w:sz w:val="18"/>
               </w:rPr>
-              <w:t>검색 인덱스</w:t>
+              <w:t>검색 데이터</w:t>
             </w:r>
           </w:p>
         </w:tc>
@@ -441,7 +419,7 @@
                 <w:color w:val="222222"/>
                 <w:sz w:val="18"/>
               </w:rPr>
-              <w:t>Chroma VectorDB · 64개 임베딩 청크</w:t>
+              <w:t>페이지 정보를 포함한 텍스트 청크 64개</w:t>
             </w:r>
           </w:p>
         </w:tc>
@@ -463,7 +441,7 @@
                 <w:color w:val="222222"/>
                 <w:sz w:val="18"/>
               </w:rPr>
-              <w:t>사용자 기능</w:t>
+              <w:t>주요 기능</w:t>
             </w:r>
           </w:p>
         </w:tc>
@@ -483,7 +461,7 @@
                 <w:color w:val="222222"/>
                 <w:sz w:val="18"/>
               </w:rPr>
-              <w:t>다국어 Q&amp;A · 맞춤형 제출서류 체크리스트</w:t>
+              <w:t>다국어 질문 답변, 출처 표시, 맞춤형 서류 체크리스트</w:t>
             </w:r>
           </w:p>
         </w:tc>
@@ -505,7 +483,7 @@
                 <w:color w:val="222222"/>
                 <w:sz w:val="18"/>
               </w:rPr>
-              <w:t>검증</w:t>
+              <w:t>사용 기술</w:t>
             </w:r>
           </w:p>
         </w:tc>
@@ -525,7 +503,7 @@
                 <w:color w:val="222222"/>
                 <w:sz w:val="18"/>
               </w:rPr>
-              <w:t>단위 테스트 12/12 · 다국어 라이브 평가 4/4</w:t>
+              <w:t>LangChain, Chroma, OpenAI API, Streamlit</w:t>
             </w:r>
           </w:p>
         </w:tc>
@@ -547,7 +525,7 @@
                 <w:color w:val="222222"/>
                 <w:sz w:val="18"/>
               </w:rPr>
-              <w:t>웹 서비스</w:t>
+              <w:t>배포</w:t>
             </w:r>
           </w:p>
         </w:tc>
@@ -567,7 +545,7 @@
                 <w:color w:val="222222"/>
                 <w:sz w:val="18"/>
               </w:rPr>
-              <w:t>Streamlit Chat/Checklist 2개 탭</w:t>
+              <w:t>GitHub + Streamlit Community Cloud</w:t>
             </w:r>
           </w:p>
         </w:tc>
@@ -580,10 +558,129 @@
     </w:p>
     <w:p>
       <w:pPr>
+        <w:pStyle w:val="Heading1"/>
+      </w:pPr>
+      <w:r>
+        <w:t>2. 구현 과정</w:t>
+      </w:r>
+    </w:p>
+    <w:p>
+      <w:pPr>
         <w:pStyle w:val="Heading2"/>
       </w:pPr>
       <w:r>
-        <w:t>1.3 과제 요구사항 대응</w:t>
+        <w:t>2.1 PDF에서 검색 데이터 만들기</w:t>
+      </w:r>
+    </w:p>
+    <w:p>
+      <w:r>
+        <w:t>먼저 모집요강 4개, 온라인 원서접수 안내 1개, 제출서류 체크리스트 1개를 모았다. pdfplumber로 페이지별 텍스트를 읽고, 추출된 글자가 너무 적은 페이지는 pypdf로 한 번 더 읽도록 했다. 이후 한 페이지의 글이 길면 최대 2,000자 단위로 나누었다. 각 조각에는 원본 파일명, 페이지 번호, 문서 언어, 학부/대학원 구분을 저장했다.</w:t>
+      </w:r>
+    </w:p>
+    <w:p>
+      <w:r>
+        <w:t>실제 문서를 돌려 보니 총 64개 청크가 나왔다. 이 수가 많지는 않지만, 약 50페이지 정도의 입학 자료를 실습용으로 검색하기에는 충분했고 출처 페이지를 유지하기도 쉬웠다.</w:t>
+      </w:r>
+    </w:p>
+    <w:p>
+      <w:pPr>
+        <w:pStyle w:val="Heading2"/>
+      </w:pPr>
+      <w:r>
+        <w:t>2.2 RAG 동작 순서</w:t>
+      </w:r>
+    </w:p>
+    <w:p>
+      <w:pPr>
+        <w:pStyle w:val="ListNumber"/>
+        <w:ind w:left="720" w:hanging="360"/>
+      </w:pPr>
+      <w:r>
+        <w:rPr>
+          <w:rFonts w:ascii="Calibri" w:hAnsi="Calibri" w:eastAsia="Malgun Gothic"/>
+          <w:b/>
+          <w:color w:val="1F4D78"/>
+        </w:rPr>
+        <w:t xml:space="preserve">임베딩: </w:t>
+      </w:r>
+      <w:r>
+        <w:t>64개 청크를 text-embedding-3-small로 변환해 Chroma에 저장했다.</w:t>
+      </w:r>
+    </w:p>
+    <w:p>
+      <w:pPr>
+        <w:pStyle w:val="ListNumber"/>
+        <w:ind w:left="720" w:hanging="360"/>
+      </w:pPr>
+      <w:r>
+        <w:rPr>
+          <w:rFonts w:ascii="Calibri" w:hAnsi="Calibri" w:eastAsia="Malgun Gothic"/>
+          <w:b/>
+          <w:color w:val="1F4D78"/>
+        </w:rPr>
+        <w:t xml:space="preserve">검색: </w:t>
+      </w:r>
+      <w:r>
+        <w:t>사용자의 질문과 의미가 가까운 문서 조각을 기본 6개 가져온다.</w:t>
+      </w:r>
+    </w:p>
+    <w:p>
+      <w:pPr>
+        <w:pStyle w:val="ListNumber"/>
+        <w:ind w:left="720" w:hanging="360"/>
+      </w:pPr>
+      <w:r>
+        <w:rPr>
+          <w:rFonts w:ascii="Calibri" w:hAnsi="Calibri" w:eastAsia="Malgun Gothic"/>
+          <w:b/>
+          <w:color w:val="1F4D78"/>
+        </w:rPr>
+        <w:t xml:space="preserve">필터: </w:t>
+      </w:r>
+      <w:r>
+        <w:t>체크리스트에서는 학부/대학원 자료와 공통 안내 문서만 검색한다.</w:t>
+      </w:r>
+    </w:p>
+    <w:p>
+      <w:pPr>
+        <w:pStyle w:val="ListNumber"/>
+        <w:ind w:left="720" w:hanging="360"/>
+      </w:pPr>
+      <w:r>
+        <w:rPr>
+          <w:rFonts w:ascii="Calibri" w:hAnsi="Calibri" w:eastAsia="Malgun Gothic"/>
+          <w:b/>
+          <w:color w:val="1F4D78"/>
+        </w:rPr>
+        <w:t xml:space="preserve">답변: </w:t>
+      </w:r>
+      <w:r>
+        <w:t>검색 결과와 질문을 gpt-4o-mini에 보내 문서 안의 내용으로만 답하게 한다.</w:t>
+      </w:r>
+    </w:p>
+    <w:p>
+      <w:pPr>
+        <w:pStyle w:val="ListNumber"/>
+        <w:ind w:left="720" w:hanging="360"/>
+      </w:pPr>
+      <w:r>
+        <w:rPr>
+          <w:rFonts w:ascii="Calibri" w:hAnsi="Calibri" w:eastAsia="Malgun Gothic"/>
+          <w:b/>
+          <w:color w:val="1F4D78"/>
+        </w:rPr>
+        <w:t xml:space="preserve">출처: </w:t>
+      </w:r>
+      <w:r>
+        <w:t>검색된 파일명과 페이지를 답변 아래에 별도로 표시한다.</w:t>
+      </w:r>
+    </w:p>
+    <w:p>
+      <w:pPr>
+        <w:pStyle w:val="Heading2"/>
+      </w:pPr>
+      <w:r>
+        <w:t>2.3 파일 구성</w:t>
       </w:r>
     </w:p>
     <w:tbl>
@@ -603,9 +700,8 @@
         </w:tblBorders>
       </w:tblPr>
       <w:tblGrid>
-        <w:gridCol w:w="2100"/>
-        <w:gridCol w:w="5760"/>
-        <w:gridCol w:w="1500"/>
+        <w:gridCol w:w="2200"/>
+        <w:gridCol w:w="7160"/>
       </w:tblGrid>
       <w:tr>
         <w:trPr>
@@ -613,7 +709,7 @@
         </w:trPr>
         <w:tc>
           <w:tcPr>
-            <w:tcW w:type="dxa" w:w="2100"/>
+            <w:tcW w:type="dxa" w:w="2200"/>
             <w:tcMar>
               <w:top w:w="80" w:type="dxa"/>
               <w:start w:w="120" w:type="dxa"/>
@@ -635,570 +731,13 @@
                 <w:color w:val="203748"/>
                 <w:sz w:val="19"/>
               </w:rPr>
-              <w:t>요구사항</w:t>
+              <w:t>파일</w:t>
             </w:r>
           </w:p>
         </w:tc>
         <w:tc>
           <w:tcPr>
-            <w:tcW w:type="dxa" w:w="5760"/>
-            <w:tcMar>
-              <w:top w:w="80" w:type="dxa"/>
-              <w:start w:w="120" w:type="dxa"/>
-              <w:bottom w:w="80" w:type="dxa"/>
-              <w:end w:w="120" w:type="dxa"/>
-            </w:tcMar>
-            <w:vAlign w:val="center"/>
-            <w:shd w:fill="F2F4F7"/>
-          </w:tcPr>
-          <w:p>
-            <w:pPr>
-              <w:spacing w:before="0" w:after="0" w:line="259" w:lineRule="auto"/>
-              <w:jc w:val="left"/>
-            </w:pPr>
-            <w:r>
-              <w:rPr>
-                <w:rFonts w:ascii="Calibri" w:hAnsi="Calibri" w:eastAsia="Malgun Gothic"/>
-                <w:b/>
-                <w:color w:val="203748"/>
-                <w:sz w:val="19"/>
-              </w:rPr>
-              <w:t>적용 내용</w:t>
-            </w:r>
-          </w:p>
-        </w:tc>
-        <w:tc>
-          <w:tcPr>
-            <w:tcW w:type="dxa" w:w="1500"/>
-            <w:tcMar>
-              <w:top w:w="80" w:type="dxa"/>
-              <w:start w:w="120" w:type="dxa"/>
-              <w:bottom w:w="80" w:type="dxa"/>
-              <w:end w:w="120" w:type="dxa"/>
-            </w:tcMar>
-            <w:vAlign w:val="center"/>
-            <w:shd w:fill="F2F4F7"/>
-          </w:tcPr>
-          <w:p>
-            <w:pPr>
-              <w:spacing w:before="0" w:after="0" w:line="259" w:lineRule="auto"/>
-              <w:jc w:val="center"/>
-            </w:pPr>
-            <w:r>
-              <w:rPr>
-                <w:rFonts w:ascii="Calibri" w:hAnsi="Calibri" w:eastAsia="Malgun Gothic"/>
-                <w:b/>
-                <w:color w:val="203748"/>
-                <w:sz w:val="19"/>
-              </w:rPr>
-              <w:t>상태</w:t>
-            </w:r>
-          </w:p>
-        </w:tc>
-      </w:tr>
-      <w:tr>
-        <w:tc>
-          <w:tcPr>
-            <w:tcW w:type="dxa" w:w="2100"/>
-          </w:tcPr>
-          <w:p>
-            <w:pPr>
-              <w:spacing w:before="0" w:after="0" w:line="259" w:lineRule="auto"/>
-              <w:jc w:val="left"/>
-            </w:pPr>
-            <w:r>
-              <w:rPr>
-                <w:rFonts w:ascii="Calibri" w:hAnsi="Calibri" w:eastAsia="Malgun Gothic"/>
-                <w:b w:val="0"/>
-                <w:color w:val="222222"/>
-                <w:sz w:val="18"/>
-              </w:rPr>
-              <w:t>Claude Code</w:t>
-            </w:r>
-          </w:p>
-        </w:tc>
-        <w:tc>
-          <w:tcPr>
-            <w:tcW w:type="dxa" w:w="5760"/>
-          </w:tcPr>
-          <w:p>
-            <w:pPr>
-              <w:spacing w:before="0" w:after="0" w:line="259" w:lineRule="auto"/>
-              <w:jc w:val="left"/>
-            </w:pPr>
-            <w:r>
-              <w:rPr>
-                <w:rFonts w:ascii="Calibri" w:hAnsi="Calibri" w:eastAsia="Malgun Gothic"/>
-                <w:b w:val="0"/>
-                <w:color w:val="222222"/>
-                <w:sz w:val="18"/>
-              </w:rPr>
-              <w:t>요구 분석, 모듈 설계, 테스트·오류 수정·배포 워크플로에 활용</w:t>
-            </w:r>
-          </w:p>
-        </w:tc>
-        <w:tc>
-          <w:tcPr>
-            <w:tcW w:type="dxa" w:w="1500"/>
-          </w:tcPr>
-          <w:p>
-            <w:pPr>
-              <w:spacing w:before="0" w:after="0" w:line="259" w:lineRule="auto"/>
-              <w:jc w:val="center"/>
-            </w:pPr>
-            <w:r>
-              <w:rPr>
-                <w:rFonts w:ascii="Calibri" w:hAnsi="Calibri" w:eastAsia="Malgun Gothic"/>
-                <w:b w:val="0"/>
-                <w:color w:val="222222"/>
-                <w:sz w:val="18"/>
-              </w:rPr>
-              <w:t>충족</w:t>
-            </w:r>
-          </w:p>
-        </w:tc>
-      </w:tr>
-      <w:tr>
-        <w:tc>
-          <w:tcPr>
-            <w:tcW w:type="dxa" w:w="2100"/>
-          </w:tcPr>
-          <w:p>
-            <w:pPr>
-              <w:spacing w:before="0" w:after="0" w:line="259" w:lineRule="auto"/>
-              <w:jc w:val="left"/>
-            </w:pPr>
-            <w:r>
-              <w:rPr>
-                <w:rFonts w:ascii="Calibri" w:hAnsi="Calibri" w:eastAsia="Malgun Gothic"/>
-                <w:b w:val="0"/>
-                <w:color w:val="222222"/>
-                <w:sz w:val="18"/>
-              </w:rPr>
-              <w:t>LangChain</w:t>
-            </w:r>
-          </w:p>
-        </w:tc>
-        <w:tc>
-          <w:tcPr>
-            <w:tcW w:type="dxa" w:w="5760"/>
-          </w:tcPr>
-          <w:p>
-            <w:pPr>
-              <w:spacing w:before="0" w:after="0" w:line="259" w:lineRule="auto"/>
-              <w:jc w:val="left"/>
-            </w:pPr>
-            <w:r>
-              <w:rPr>
-                <w:rFonts w:ascii="Calibri" w:hAnsi="Calibri" w:eastAsia="Malgun Gothic"/>
-                <w:b w:val="0"/>
-                <w:color w:val="222222"/>
-                <w:sz w:val="18"/>
-              </w:rPr>
-              <w:t>Document, OpenAIEmbeddings, ChatOpenAI, Chroma 연동</w:t>
-            </w:r>
-          </w:p>
-        </w:tc>
-        <w:tc>
-          <w:tcPr>
-            <w:tcW w:type="dxa" w:w="1500"/>
-          </w:tcPr>
-          <w:p>
-            <w:pPr>
-              <w:spacing w:before="0" w:after="0" w:line="259" w:lineRule="auto"/>
-              <w:jc w:val="center"/>
-            </w:pPr>
-            <w:r>
-              <w:rPr>
-                <w:rFonts w:ascii="Calibri" w:hAnsi="Calibri" w:eastAsia="Malgun Gothic"/>
-                <w:b w:val="0"/>
-                <w:color w:val="222222"/>
-                <w:sz w:val="18"/>
-              </w:rPr>
-              <w:t>충족</w:t>
-            </w:r>
-          </w:p>
-        </w:tc>
-      </w:tr>
-      <w:tr>
-        <w:tc>
-          <w:tcPr>
-            <w:tcW w:type="dxa" w:w="2100"/>
-          </w:tcPr>
-          <w:p>
-            <w:pPr>
-              <w:spacing w:before="0" w:after="0" w:line="259" w:lineRule="auto"/>
-              <w:jc w:val="left"/>
-            </w:pPr>
-            <w:r>
-              <w:rPr>
-                <w:rFonts w:ascii="Calibri" w:hAnsi="Calibri" w:eastAsia="Malgun Gothic"/>
-                <w:b w:val="0"/>
-                <w:color w:val="222222"/>
-                <w:sz w:val="18"/>
-              </w:rPr>
-              <w:t>RAG</w:t>
-            </w:r>
-          </w:p>
-        </w:tc>
-        <w:tc>
-          <w:tcPr>
-            <w:tcW w:type="dxa" w:w="5760"/>
-          </w:tcPr>
-          <w:p>
-            <w:pPr>
-              <w:spacing w:before="0" w:after="0" w:line="259" w:lineRule="auto"/>
-              <w:jc w:val="left"/>
-            </w:pPr>
-            <w:r>
-              <w:rPr>
-                <w:rFonts w:ascii="Calibri" w:hAnsi="Calibri" w:eastAsia="Malgun Gothic"/>
-                <w:b w:val="0"/>
-                <w:color w:val="222222"/>
-                <w:sz w:val="18"/>
-              </w:rPr>
-              <w:t>다국어 문서 추출→임베딩→검색→근거 기반 생성</w:t>
-            </w:r>
-          </w:p>
-        </w:tc>
-        <w:tc>
-          <w:tcPr>
-            <w:tcW w:type="dxa" w:w="1500"/>
-          </w:tcPr>
-          <w:p>
-            <w:pPr>
-              <w:spacing w:before="0" w:after="0" w:line="259" w:lineRule="auto"/>
-              <w:jc w:val="center"/>
-            </w:pPr>
-            <w:r>
-              <w:rPr>
-                <w:rFonts w:ascii="Calibri" w:hAnsi="Calibri" w:eastAsia="Malgun Gothic"/>
-                <w:b w:val="0"/>
-                <w:color w:val="222222"/>
-                <w:sz w:val="18"/>
-              </w:rPr>
-              <w:t>충족</w:t>
-            </w:r>
-          </w:p>
-        </w:tc>
-      </w:tr>
-      <w:tr>
-        <w:tc>
-          <w:tcPr>
-            <w:tcW w:type="dxa" w:w="2100"/>
-          </w:tcPr>
-          <w:p>
-            <w:pPr>
-              <w:spacing w:before="0" w:after="0" w:line="259" w:lineRule="auto"/>
-              <w:jc w:val="left"/>
-            </w:pPr>
-            <w:r>
-              <w:rPr>
-                <w:rFonts w:ascii="Calibri" w:hAnsi="Calibri" w:eastAsia="Malgun Gothic"/>
-                <w:b w:val="0"/>
-                <w:color w:val="222222"/>
-                <w:sz w:val="18"/>
-              </w:rPr>
-              <w:t>고차원 기능</w:t>
-            </w:r>
-          </w:p>
-        </w:tc>
-        <w:tc>
-          <w:tcPr>
-            <w:tcW w:type="dxa" w:w="5760"/>
-          </w:tcPr>
-          <w:p>
-            <w:pPr>
-              <w:spacing w:before="0" w:after="0" w:line="259" w:lineRule="auto"/>
-              <w:jc w:val="left"/>
-            </w:pPr>
-            <w:r>
-              <w:rPr>
-                <w:rFonts w:ascii="Calibri" w:hAnsi="Calibri" w:eastAsia="Malgun Gothic"/>
-                <w:b w:val="0"/>
-                <w:color w:val="222222"/>
-                <w:sz w:val="18"/>
-              </w:rPr>
-              <w:t>출처 Q&amp;A, 답변 거절, 지원자별 체크리스트</w:t>
-            </w:r>
-          </w:p>
-        </w:tc>
-        <w:tc>
-          <w:tcPr>
-            <w:tcW w:type="dxa" w:w="1500"/>
-          </w:tcPr>
-          <w:p>
-            <w:pPr>
-              <w:spacing w:before="0" w:after="0" w:line="259" w:lineRule="auto"/>
-              <w:jc w:val="center"/>
-            </w:pPr>
-            <w:r>
-              <w:rPr>
-                <w:rFonts w:ascii="Calibri" w:hAnsi="Calibri" w:eastAsia="Malgun Gothic"/>
-                <w:b w:val="0"/>
-                <w:color w:val="222222"/>
-                <w:sz w:val="18"/>
-              </w:rPr>
-              <w:t>충족</w:t>
-            </w:r>
-          </w:p>
-        </w:tc>
-      </w:tr>
-      <w:tr>
-        <w:tc>
-          <w:tcPr>
-            <w:tcW w:type="dxa" w:w="2100"/>
-          </w:tcPr>
-          <w:p>
-            <w:pPr>
-              <w:spacing w:before="0" w:after="0" w:line="259" w:lineRule="auto"/>
-              <w:jc w:val="left"/>
-            </w:pPr>
-            <w:r>
-              <w:rPr>
-                <w:rFonts w:ascii="Calibri" w:hAnsi="Calibri" w:eastAsia="Malgun Gothic"/>
-                <w:b w:val="0"/>
-                <w:color w:val="222222"/>
-                <w:sz w:val="18"/>
-              </w:rPr>
-              <w:t>웹 배포</w:t>
-            </w:r>
-          </w:p>
-        </w:tc>
-        <w:tc>
-          <w:tcPr>
-            <w:tcW w:type="dxa" w:w="5760"/>
-          </w:tcPr>
-          <w:p>
-            <w:pPr>
-              <w:spacing w:before="0" w:after="0" w:line="259" w:lineRule="auto"/>
-              <w:jc w:val="left"/>
-            </w:pPr>
-            <w:r>
-              <w:rPr>
-                <w:rFonts w:ascii="Calibri" w:hAnsi="Calibri" w:eastAsia="Malgun Gothic"/>
-                <w:b w:val="0"/>
-                <w:color w:val="222222"/>
-                <w:sz w:val="18"/>
-              </w:rPr>
-              <w:t>GitHub 기반 Streamlit Community Cloud 배포</w:t>
-            </w:r>
-          </w:p>
-        </w:tc>
-        <w:tc>
-          <w:tcPr>
-            <w:tcW w:type="dxa" w:w="1500"/>
-          </w:tcPr>
-          <w:p>
-            <w:pPr>
-              <w:spacing w:before="0" w:after="0" w:line="259" w:lineRule="auto"/>
-              <w:jc w:val="center"/>
-            </w:pPr>
-            <w:r>
-              <w:rPr>
-                <w:rFonts w:ascii="Calibri" w:hAnsi="Calibri" w:eastAsia="Malgun Gothic"/>
-                <w:b w:val="0"/>
-                <w:color w:val="222222"/>
-                <w:sz w:val="18"/>
-              </w:rPr>
-              <w:t>완료</w:t>
-            </w:r>
-          </w:p>
-        </w:tc>
-      </w:tr>
-    </w:tbl>
-    <w:p>
-      <w:pPr>
-        <w:spacing w:before="0" w:after="60"/>
-      </w:pPr>
-    </w:p>
-    <w:p>
-      <w:pPr>
-        <w:pStyle w:val="Heading1"/>
-      </w:pPr>
-      <w:r>
-        <w:t>2. 시스템 설계</w:t>
-      </w:r>
-    </w:p>
-    <w:p>
-      <w:r>
-        <w:t>서비스는 사전 구축 단계와 사용자 요청 단계로 분리된다. 사전 구축에서는 PDF를 추출·임베딩하여 영속 Chroma 인덱스를 만들고, 요청 단계에서는 질문마다 관련 문맥을 검색해 LLM에 제한된 근거로 제공한다.</w:t>
-      </w:r>
-    </w:p>
-    <w:p>
-      <w:pPr>
-        <w:pStyle w:val="Heading2"/>
-      </w:pPr>
-      <w:r>
-        <w:t>2.1 데이터 흐름</w:t>
-      </w:r>
-    </w:p>
-    <w:p>
-      <w:pPr>
-        <w:pStyle w:val="ListNumber"/>
-        <w:ind w:left="720" w:hanging="360"/>
-      </w:pPr>
-      <w:r>
-        <w:rPr>
-          <w:rFonts w:ascii="Calibri" w:hAnsi="Calibri" w:eastAsia="Malgun Gothic"/>
-          <w:b/>
-          <w:color w:val="1F4D78"/>
-        </w:rPr>
-        <w:t xml:space="preserve">PDF 추출: </w:t>
-      </w:r>
-      <w:r>
-        <w:t>`pdfplumber`를 우선 사용하고 짧은 페이지는 `pypdf`로 보완한다.</w:t>
-      </w:r>
-    </w:p>
-    <w:p>
-      <w:pPr>
-        <w:pStyle w:val="ListNumber"/>
-        <w:ind w:left="720" w:hanging="360"/>
-      </w:pPr>
-      <w:r>
-        <w:rPr>
-          <w:rFonts w:ascii="Calibri" w:hAnsi="Calibri" w:eastAsia="Malgun Gothic"/>
-          <w:b/>
-          <w:color w:val="1F4D78"/>
-        </w:rPr>
-        <w:t xml:space="preserve">청크 분할: </w:t>
-      </w:r>
-      <w:r>
-        <w:t>페이지 정보를 유지하면서 최대 2,000자 단위로 문서를 분할한다.</w:t>
-      </w:r>
-    </w:p>
-    <w:p>
-      <w:pPr>
-        <w:pStyle w:val="ListNumber"/>
-        <w:ind w:left="720" w:hanging="360"/>
-      </w:pPr>
-      <w:r>
-        <w:rPr>
-          <w:rFonts w:ascii="Calibri" w:hAnsi="Calibri" w:eastAsia="Malgun Gothic"/>
-          <w:b/>
-          <w:color w:val="1F4D78"/>
-        </w:rPr>
-        <w:t xml:space="preserve">메타데이터: </w:t>
-      </w:r>
-      <w:r>
-        <w:t>source, page, lang, level을 각 청크에 저장한다.</w:t>
-      </w:r>
-    </w:p>
-    <w:p>
-      <w:pPr>
-        <w:pStyle w:val="ListNumber"/>
-        <w:ind w:left="720" w:hanging="360"/>
-      </w:pPr>
-      <w:r>
-        <w:rPr>
-          <w:rFonts w:ascii="Calibri" w:hAnsi="Calibri" w:eastAsia="Malgun Gothic"/>
-          <w:b/>
-          <w:color w:val="1F4D78"/>
-        </w:rPr>
-        <w:t xml:space="preserve">임베딩: </w:t>
-      </w:r>
-      <w:r>
-        <w:t>`text-embedding-3-small`로 의미 벡터를 생성한다.</w:t>
-      </w:r>
-    </w:p>
-    <w:p>
-      <w:pPr>
-        <w:pStyle w:val="ListNumber"/>
-        <w:ind w:left="720" w:hanging="360"/>
-      </w:pPr>
-      <w:r>
-        <w:rPr>
-          <w:rFonts w:ascii="Calibri" w:hAnsi="Calibri" w:eastAsia="Malgun Gothic"/>
-          <w:b/>
-          <w:color w:val="1F4D78"/>
-        </w:rPr>
-        <w:t xml:space="preserve">검색: </w:t>
-      </w:r>
-      <w:r>
-        <w:t>질문과 유사한 상위 문서를 찾고 지원 과정 필터를 적용한다.</w:t>
-      </w:r>
-    </w:p>
-    <w:p>
-      <w:pPr>
-        <w:pStyle w:val="ListNumber"/>
-        <w:ind w:left="720" w:hanging="360"/>
-      </w:pPr>
-      <w:r>
-        <w:rPr>
-          <w:rFonts w:ascii="Calibri" w:hAnsi="Calibri" w:eastAsia="Malgun Gothic"/>
-          <w:b/>
-          <w:color w:val="1F4D78"/>
-        </w:rPr>
-        <w:t xml:space="preserve">생성: </w:t>
-      </w:r>
-      <w:r>
-        <w:t>`gpt-4o-mini`가 검색 문맥만 사용하여 질문 언어로 답변한다.</w:t>
-      </w:r>
-    </w:p>
-    <w:p>
-      <w:pPr>
-        <w:pStyle w:val="Heading2"/>
-      </w:pPr>
-      <w:r>
-        <w:t>2.2 주요 컴포넌트</w:t>
-      </w:r>
-    </w:p>
-    <w:tbl>
-      <w:tblPr>
-        <w:tblW w:type="dxa" w:w="9360"/>
-        <w:jc w:val="left"/>
-        <w:tblLayout w:type="fixed"/>
-        <w:tblLook w:firstColumn="1" w:firstRow="1" w:lastColumn="0" w:lastRow="0" w:noHBand="0" w:noVBand="1" w:val="04A0"/>
-        <w:tblInd w:w="120" w:type="dxa"/>
-        <w:tblBorders>
-          <w:top w:val="single" w:sz="6" w:space="0" w:color="D8DEE5"/>
-          <w:left w:val="single" w:sz="6" w:space="0" w:color="D8DEE5"/>
-          <w:bottom w:val="single" w:sz="6" w:space="0" w:color="D8DEE5"/>
-          <w:right w:val="single" w:sz="6" w:space="0" w:color="D8DEE5"/>
-          <w:insideH w:val="single" w:sz="6" w:space="0" w:color="D8DEE5"/>
-          <w:insideV w:val="single" w:sz="6" w:space="0" w:color="D8DEE5"/>
-        </w:tblBorders>
-      </w:tblPr>
-      <w:tblGrid>
-        <w:gridCol w:w="1700"/>
-        <w:gridCol w:w="2600"/>
-        <w:gridCol w:w="5060"/>
-      </w:tblGrid>
-      <w:tr>
-        <w:trPr>
-          <w:tblHeader w:val="true"/>
-        </w:trPr>
-        <w:tc>
-          <w:tcPr>
-            <w:tcW w:type="dxa" w:w="1700"/>
-            <w:tcMar>
-              <w:top w:w="80" w:type="dxa"/>
-              <w:start w:w="120" w:type="dxa"/>
-              <w:bottom w:w="80" w:type="dxa"/>
-              <w:end w:w="120" w:type="dxa"/>
-            </w:tcMar>
-            <w:vAlign w:val="center"/>
-            <w:shd w:fill="F2F4F7"/>
-          </w:tcPr>
-          <w:p>
-            <w:pPr>
-              <w:spacing w:before="0" w:after="0" w:line="259" w:lineRule="auto"/>
-              <w:jc w:val="left"/>
-            </w:pPr>
-            <w:r>
-              <w:rPr>
-                <w:rFonts w:ascii="Calibri" w:hAnsi="Calibri" w:eastAsia="Malgun Gothic"/>
-                <w:b/>
-                <w:color w:val="203748"/>
-                <w:sz w:val="19"/>
-              </w:rPr>
-              <w:t>모듈</w:t>
-            </w:r>
-          </w:p>
-        </w:tc>
-        <w:tc>
-          <w:tcPr>
-            <w:tcW w:type="dxa" w:w="2600"/>
+            <w:tcW w:type="dxa" w:w="7160"/>
             <w:tcMar>
               <w:top w:w="80" w:type="dxa"/>
               <w:start w:w="120" w:type="dxa"/>
@@ -1224,9 +763,430 @@
             </w:r>
           </w:p>
         </w:tc>
+      </w:tr>
+      <w:tr>
         <w:tc>
           <w:tcPr>
-            <w:tcW w:type="dxa" w:w="5060"/>
+            <w:tcW w:type="dxa" w:w="2200"/>
+          </w:tcPr>
+          <w:p>
+            <w:pPr>
+              <w:spacing w:before="0" w:after="0" w:line="259" w:lineRule="auto"/>
+              <w:jc w:val="left"/>
+            </w:pPr>
+            <w:r>
+              <w:rPr>
+                <w:rFonts w:ascii="Calibri" w:hAnsi="Calibri" w:eastAsia="Malgun Gothic"/>
+                <w:b w:val="0"/>
+                <w:color w:val="222222"/>
+                <w:sz w:val="18"/>
+              </w:rPr>
+              <w:t>extract.py</w:t>
+            </w:r>
+          </w:p>
+        </w:tc>
+        <w:tc>
+          <w:tcPr>
+            <w:tcW w:type="dxa" w:w="7160"/>
+          </w:tcPr>
+          <w:p>
+            <w:pPr>
+              <w:spacing w:before="0" w:after="0" w:line="259" w:lineRule="auto"/>
+              <w:jc w:val="left"/>
+            </w:pPr>
+            <w:r>
+              <w:rPr>
+                <w:rFonts w:ascii="Calibri" w:hAnsi="Calibri" w:eastAsia="Malgun Gothic"/>
+                <w:b w:val="0"/>
+                <w:color w:val="222222"/>
+                <w:sz w:val="18"/>
+              </w:rPr>
+              <w:t>PDF를 읽고 페이지 정보가 있는 청크로 나눈다.</w:t>
+            </w:r>
+          </w:p>
+        </w:tc>
+      </w:tr>
+      <w:tr>
+        <w:tc>
+          <w:tcPr>
+            <w:tcW w:type="dxa" w:w="2200"/>
+          </w:tcPr>
+          <w:p>
+            <w:pPr>
+              <w:spacing w:before="0" w:after="0" w:line="259" w:lineRule="auto"/>
+              <w:jc w:val="left"/>
+            </w:pPr>
+            <w:r>
+              <w:rPr>
+                <w:rFonts w:ascii="Calibri" w:hAnsi="Calibri" w:eastAsia="Malgun Gothic"/>
+                <w:b w:val="0"/>
+                <w:color w:val="222222"/>
+                <w:sz w:val="18"/>
+              </w:rPr>
+              <w:t>ingest.py</w:t>
+            </w:r>
+          </w:p>
+        </w:tc>
+        <w:tc>
+          <w:tcPr>
+            <w:tcW w:type="dxa" w:w="7160"/>
+          </w:tcPr>
+          <w:p>
+            <w:pPr>
+              <w:spacing w:before="0" w:after="0" w:line="259" w:lineRule="auto"/>
+              <w:jc w:val="left"/>
+            </w:pPr>
+            <w:r>
+              <w:rPr>
+                <w:rFonts w:ascii="Calibri" w:hAnsi="Calibri" w:eastAsia="Malgun Gothic"/>
+                <w:b w:val="0"/>
+                <w:color w:val="222222"/>
+                <w:sz w:val="18"/>
+              </w:rPr>
+              <w:t>청크를 임베딩해 persistent Chroma DB를 만든다.</w:t>
+            </w:r>
+          </w:p>
+        </w:tc>
+      </w:tr>
+      <w:tr>
+        <w:tc>
+          <w:tcPr>
+            <w:tcW w:type="dxa" w:w="2200"/>
+          </w:tcPr>
+          <w:p>
+            <w:pPr>
+              <w:spacing w:before="0" w:after="0" w:line="259" w:lineRule="auto"/>
+              <w:jc w:val="left"/>
+            </w:pPr>
+            <w:r>
+              <w:rPr>
+                <w:rFonts w:ascii="Calibri" w:hAnsi="Calibri" w:eastAsia="Malgun Gothic"/>
+                <w:b w:val="0"/>
+                <w:color w:val="222222"/>
+                <w:sz w:val="18"/>
+              </w:rPr>
+              <w:t>retriever.py</w:t>
+            </w:r>
+          </w:p>
+        </w:tc>
+        <w:tc>
+          <w:tcPr>
+            <w:tcW w:type="dxa" w:w="7160"/>
+          </w:tcPr>
+          <w:p>
+            <w:pPr>
+              <w:spacing w:before="0" w:after="0" w:line="259" w:lineRule="auto"/>
+              <w:jc w:val="left"/>
+            </w:pPr>
+            <w:r>
+              <w:rPr>
+                <w:rFonts w:ascii="Calibri" w:hAnsi="Calibri" w:eastAsia="Malgun Gothic"/>
+                <w:b w:val="0"/>
+                <w:color w:val="222222"/>
+                <w:sz w:val="18"/>
+              </w:rPr>
+              <w:t>질문과 가까운 문서를 검색하고 과정 필터를 적용한다.</w:t>
+            </w:r>
+          </w:p>
+        </w:tc>
+      </w:tr>
+      <w:tr>
+        <w:tc>
+          <w:tcPr>
+            <w:tcW w:type="dxa" w:w="2200"/>
+          </w:tcPr>
+          <w:p>
+            <w:pPr>
+              <w:spacing w:before="0" w:after="0" w:line="259" w:lineRule="auto"/>
+              <w:jc w:val="left"/>
+            </w:pPr>
+            <w:r>
+              <w:rPr>
+                <w:rFonts w:ascii="Calibri" w:hAnsi="Calibri" w:eastAsia="Malgun Gothic"/>
+                <w:b w:val="0"/>
+                <w:color w:val="222222"/>
+                <w:sz w:val="18"/>
+              </w:rPr>
+              <w:t>answerer.py</w:t>
+            </w:r>
+          </w:p>
+        </w:tc>
+        <w:tc>
+          <w:tcPr>
+            <w:tcW w:type="dxa" w:w="7160"/>
+          </w:tcPr>
+          <w:p>
+            <w:pPr>
+              <w:spacing w:before="0" w:after="0" w:line="259" w:lineRule="auto"/>
+              <w:jc w:val="left"/>
+            </w:pPr>
+            <w:r>
+              <w:rPr>
+                <w:rFonts w:ascii="Calibri" w:hAnsi="Calibri" w:eastAsia="Malgun Gothic"/>
+                <w:b w:val="0"/>
+                <w:color w:val="222222"/>
+                <w:sz w:val="18"/>
+              </w:rPr>
+              <w:t>검색 문서만 근거로 다국어 답변과 출처를 만든다.</w:t>
+            </w:r>
+          </w:p>
+        </w:tc>
+      </w:tr>
+      <w:tr>
+        <w:tc>
+          <w:tcPr>
+            <w:tcW w:type="dxa" w:w="2200"/>
+          </w:tcPr>
+          <w:p>
+            <w:pPr>
+              <w:spacing w:before="0" w:after="0" w:line="259" w:lineRule="auto"/>
+              <w:jc w:val="left"/>
+            </w:pPr>
+            <w:r>
+              <w:rPr>
+                <w:rFonts w:ascii="Calibri" w:hAnsi="Calibri" w:eastAsia="Malgun Gothic"/>
+                <w:b w:val="0"/>
+                <w:color w:val="222222"/>
+                <w:sz w:val="18"/>
+              </w:rPr>
+              <w:t>checklist.py</w:t>
+            </w:r>
+          </w:p>
+        </w:tc>
+        <w:tc>
+          <w:tcPr>
+            <w:tcW w:type="dxa" w:w="7160"/>
+          </w:tcPr>
+          <w:p>
+            <w:pPr>
+              <w:spacing w:before="0" w:after="0" w:line="259" w:lineRule="auto"/>
+              <w:jc w:val="left"/>
+            </w:pPr>
+            <w:r>
+              <w:rPr>
+                <w:rFonts w:ascii="Calibri" w:hAnsi="Calibri" w:eastAsia="Malgun Gothic"/>
+                <w:b w:val="0"/>
+                <w:color w:val="222222"/>
+                <w:sz w:val="18"/>
+              </w:rPr>
+              <w:t>지원 조건을 반영한 제출서류 목록을 만든다.</w:t>
+            </w:r>
+          </w:p>
+        </w:tc>
+      </w:tr>
+      <w:tr>
+        <w:tc>
+          <w:tcPr>
+            <w:tcW w:type="dxa" w:w="2200"/>
+          </w:tcPr>
+          <w:p>
+            <w:pPr>
+              <w:spacing w:before="0" w:after="0" w:line="259" w:lineRule="auto"/>
+              <w:jc w:val="left"/>
+            </w:pPr>
+            <w:r>
+              <w:rPr>
+                <w:rFonts w:ascii="Calibri" w:hAnsi="Calibri" w:eastAsia="Malgun Gothic"/>
+                <w:b w:val="0"/>
+                <w:color w:val="222222"/>
+                <w:sz w:val="18"/>
+              </w:rPr>
+              <w:t>app.py</w:t>
+            </w:r>
+          </w:p>
+        </w:tc>
+        <w:tc>
+          <w:tcPr>
+            <w:tcW w:type="dxa" w:w="7160"/>
+          </w:tcPr>
+          <w:p>
+            <w:pPr>
+              <w:spacing w:before="0" w:after="0" w:line="259" w:lineRule="auto"/>
+              <w:jc w:val="left"/>
+            </w:pPr>
+            <w:r>
+              <w:rPr>
+                <w:rFonts w:ascii="Calibri" w:hAnsi="Calibri" w:eastAsia="Malgun Gothic"/>
+                <w:b w:val="0"/>
+                <w:color w:val="222222"/>
+                <w:sz w:val="18"/>
+              </w:rPr>
+              <w:t>질문 탭과 체크리스트 탭을 제공하는 Streamlit 화면이다.</w:t>
+            </w:r>
+          </w:p>
+        </w:tc>
+      </w:tr>
+    </w:tbl>
+    <w:p>
+      <w:pPr>
+        <w:spacing w:before="0" w:after="60"/>
+      </w:pPr>
+    </w:p>
+    <w:p>
+      <w:pPr>
+        <w:pStyle w:val="Heading2"/>
+      </w:pPr>
+      <w:r>
+        <w:t>2.4 다국어 질문 처리</w:t>
+      </w:r>
+    </w:p>
+    <w:p>
+      <w:r>
+        <w:t>원본 문서는 한국어와 영어지만 임베딩 모델이 여러 언어의 의미를 비교할 수 있기 때문에, 중국어와 베트남어 질문도 관련 영어 또는 한국어 문서로 연결할 수 있었다. 답변 프롬프트에는 사용자가 질문한 언어로 답하라는 조건을 넣었다. 따라서 별도의 번역기처럼 문장을 1:1로 바꾸는 것이 아니라, 다른 언어로 검색한 뒤 필요한 내용을 정리해서 답하는 구조다.</w:t>
+      </w:r>
+    </w:p>
+    <w:p>
+      <w:pPr>
+        <w:pStyle w:val="Heading1"/>
+      </w:pPr>
+      <w:r>
+        <w:t>3. 완성한 기능</w:t>
+      </w:r>
+    </w:p>
+    <w:p>
+      <w:pPr>
+        <w:pStyle w:val="Heading2"/>
+      </w:pPr>
+      <w:r>
+        <w:t>3.1 다국어 질문 답변</w:t>
+      </w:r>
+    </w:p>
+    <w:p>
+      <w:r>
+        <w:t>첫 번째 탭에서는 사용자가 자연어로 질문할 수 있다. 예를 들어 영어로 지원 마감일을 묻거나, 중국어로 학부 지원 서류를 물어도 관련 모집요강을 검색한다. 답변 아래에는 실제로 검색된 PDF와 페이지가 표시된다. 중요한 날짜나 금액을 확인할 때 원문으로 다시 돌아갈 수 있게 한 것이다.</w:t>
+      </w:r>
+    </w:p>
+    <w:p>
+      <w:pPr>
+        <w:pStyle w:val="Heading2"/>
+      </w:pPr>
+      <w:r>
+        <w:t>3.2 제출서류 체크리스트</w:t>
+      </w:r>
+    </w:p>
+    <w:p>
+      <w:r>
+        <w:t>두 번째 탭에서는 학부/대학원, 전공, 신입/편입, 원하는 답변 언어를 입력한다. 그러면 일반 체크리스트와 해당 과정의 모집요강을 같이 검색해 번호가 있는 준비 서류 목록을 만든다. 지원자에 따라 달라질 수 있는 어학 성적이나 가족관계 서류는 조건이 있다는 점도 함께 설명하도록 했다.</w:t>
+      </w:r>
+    </w:p>
+    <w:p>
+      <w:pPr>
+        <w:pStyle w:val="Heading2"/>
+      </w:pPr>
+      <w:r>
+        <w:t>3.3 답변을 찾지 못했을 때</w:t>
+      </w:r>
+    </w:p>
+    <w:p>
+      <w:r>
+        <w:t>검색 결과가 비어 있으면 모델을 호출하지 않고 '공식 문서에서 찾지 못했으니 입학처에 확인해 달라'는 문구를 반환한다. 입학 정보는 잘못된 날짜 하나도 문제가 될 수 있기 때문에, 그럴듯한 답을 만드는 것보다 모른다고 말하는 편이 더 중요하다고 판단했다.</w:t>
+      </w:r>
+    </w:p>
+    <w:p>
+      <w:pPr>
+        <w:pStyle w:val="Heading1"/>
+      </w:pPr>
+      <w:r>
+        <w:t>4. 개발하면서 생긴 문제</w:t>
+      </w:r>
+    </w:p>
+    <w:p>
+      <w:pPr>
+        <w:pStyle w:val="Heading2"/>
+      </w:pPr>
+      <w:r>
+        <w:t>4.1 PDF가 두 번 들어가던 문제</w:t>
+      </w:r>
+    </w:p>
+    <w:p>
+      <w:r>
+        <w:t>처음에는 소문자 *.pdf와 대문자 *.PDF를 각각 검색했다. 그런데 Windows에서는 두 패턴이 같은 파일을 모두 잡아서 64개여야 할 청크가 128개가 되었다. 테스트 자체는 통과했지만 그대로 두면 임베딩 비용과 검색 결과가 중복될 수 있었다. 파일명을 기준으로 경로를 한 번만 남기도록 수정한 뒤 청크가 64개인지 다시 확인했다. 예상하지 못했던 운영체제 차이였다.</w:t>
+      </w:r>
+    </w:p>
+    <w:p>
+      <w:pPr>
+        <w:pStyle w:val="Heading2"/>
+      </w:pPr>
+      <w:r>
+        <w:t>4.2 표와 이미지가 많은 PDF</w:t>
+      </w:r>
+    </w:p>
+    <w:p>
+      <w:r>
+        <w:t>모집요강에는 표가 많아서 일반 텍스트 추출만 사용하면 줄 순서가 자연스럽지 않은 부분이 있었다. 이번 버전에서는 표 처리에 비교적 나은 pdfplumber를 우선 사용하고 pypdf를 보조로 사용했다. 여섯 파일의 모든 페이지에서 텍스트가 나오기는 했지만, 스크린샷 안의 글자까지 읽는 OCR은 넣지 못했다.</w:t>
+      </w:r>
+    </w:p>
+    <w:p>
+      <w:pPr>
+        <w:pStyle w:val="Heading2"/>
+      </w:pPr>
+      <w:r>
+        <w:t>4.3 배포 시 API 키 관리</w:t>
+      </w:r>
+    </w:p>
+    <w:p>
+      <w:r>
+        <w:t>로컬에서는 .env를 사용했지만 GitHub에는 키가 올라가면 안 된다. .env와 기존 키 파일을 .gitignore에 넣고, Streamlit 배포에서는 Secrets에 OPENAI_API_KEY를 따로 등록했다. 마지막 푸시 전에 커밋 대상 파일에 키 형태의 문자열이 없는지도 확인했다.</w:t>
+      </w:r>
+    </w:p>
+    <w:p>
+      <w:pPr>
+        <w:pStyle w:val="Heading1"/>
+      </w:pPr>
+      <w:r>
+        <w:t>5. Claude Code를 사용한 부분</w:t>
+      </w:r>
+    </w:p>
+    <w:p>
+      <w:r>
+        <w:t>Claude Code는 서비스 안에서 답변하는 모델이 아니라 개발 과정의 도구로 사용했다. 처음에는 요구사항을 기능별 파일로 나누고 각 함수의 입력과 출력을 정리하는 데 도움을 받았다. 이후 테스트 코드를 먼저 만들고, 실패하는 부분을 확인한 뒤 구현하는 순서로 진행했다.</w:t>
+      </w:r>
+    </w:p>
+    <w:p>
+      <w:r>
+        <w:t>생성된 코드를 그대로 끝내지는 않았다. 실제 PDF를 실행했을 때 나온 청크 수를 확인했고, Windows 중복 문제처럼 계획에 없던 오류는 원인을 다시 찾아 수정했다. 마지막에는 테스트, 비밀키 검사, Git 상태, Streamlit 공개 URL을 각각 확인했다. 이 과정에서 AI 코딩 도구도 실행 결과를 직접 검토해야 한다는 점을 배웠다.</w:t>
+      </w:r>
+    </w:p>
+    <w:p>
+      <w:pPr>
+        <w:pStyle w:val="Heading1"/>
+      </w:pPr>
+      <w:r>
+        <w:t>6. 테스트 결과</w:t>
+      </w:r>
+    </w:p>
+    <w:p>
+      <w:r>
+        <w:t>자동 테스트는 총 12개를 작성했다. 설정값과 파일명 분류, PDF 청크, 빈 검색 결과 처리, 체크리스트 거절 로직, 안정적인 문서 ID, 과정 필터를 확인했다.</w:t>
+      </w:r>
+    </w:p>
+    <w:tbl>
+      <w:tblPr>
+        <w:tblW w:type="dxa" w:w="9360"/>
+        <w:jc w:val="left"/>
+        <w:tblLayout w:type="fixed"/>
+        <w:tblLook w:firstColumn="1" w:firstRow="1" w:lastColumn="0" w:lastRow="0" w:noHBand="0" w:noVBand="1" w:val="04A0"/>
+        <w:tblInd w:w="120" w:type="dxa"/>
+        <w:tblBorders>
+          <w:top w:val="single" w:sz="6" w:space="0" w:color="D8DEE5"/>
+          <w:left w:val="single" w:sz="6" w:space="0" w:color="D8DEE5"/>
+          <w:bottom w:val="single" w:sz="6" w:space="0" w:color="D8DEE5"/>
+          <w:right w:val="single" w:sz="6" w:space="0" w:color="D8DEE5"/>
+          <w:insideH w:val="single" w:sz="6" w:space="0" w:color="D8DEE5"/>
+          <w:insideV w:val="single" w:sz="6" w:space="0" w:color="D8DEE5"/>
+        </w:tblBorders>
+      </w:tblPr>
+      <w:tblGrid>
+        <w:gridCol w:w="3300"/>
+        <w:gridCol w:w="6060"/>
+      </w:tblGrid>
+      <w:tr>
+        <w:trPr>
+          <w:tblHeader w:val="true"/>
+        </w:trPr>
+        <w:tc>
+          <w:tcPr>
+            <w:tcW w:type="dxa" w:w="3300"/>
             <w:tcMar>
               <w:top w:w="80" w:type="dxa"/>
               <w:start w:w="120" w:type="dxa"/>
@@ -1248,498 +1208,13 @@
                 <w:color w:val="203748"/>
                 <w:sz w:val="19"/>
               </w:rPr>
-              <w:t>핵심 설계</w:t>
-            </w:r>
-          </w:p>
-        </w:tc>
-      </w:tr>
-      <w:tr>
-        <w:tc>
-          <w:tcPr>
-            <w:tcW w:type="dxa" w:w="1700"/>
-          </w:tcPr>
-          <w:p>
-            <w:pPr>
-              <w:spacing w:before="0" w:after="0" w:line="259" w:lineRule="auto"/>
-              <w:jc w:val="left"/>
-            </w:pPr>
-            <w:r>
-              <w:rPr>
-                <w:rFonts w:ascii="Calibri" w:hAnsi="Calibri" w:eastAsia="Malgun Gothic"/>
-                <w:b w:val="0"/>
-                <w:color w:val="222222"/>
-                <w:sz w:val="18"/>
-              </w:rPr>
-              <w:t>extract.py</w:t>
+              <w:t>확인한 항목</w:t>
             </w:r>
           </w:p>
         </w:tc>
         <w:tc>
           <w:tcPr>
-            <w:tcW w:type="dxa" w:w="2600"/>
-          </w:tcPr>
-          <w:p>
-            <w:pPr>
-              <w:spacing w:before="0" w:after="0" w:line="259" w:lineRule="auto"/>
-              <w:jc w:val="left"/>
-            </w:pPr>
-            <w:r>
-              <w:rPr>
-                <w:rFonts w:ascii="Calibri" w:hAnsi="Calibri" w:eastAsia="Malgun Gothic"/>
-                <w:b w:val="0"/>
-                <w:color w:val="222222"/>
-                <w:sz w:val="18"/>
-              </w:rPr>
-              <w:t>PDF 텍스트 추출·분할</w:t>
-            </w:r>
-          </w:p>
-        </w:tc>
-        <w:tc>
-          <w:tcPr>
-            <w:tcW w:type="dxa" w:w="5060"/>
-          </w:tcPr>
-          <w:p>
-            <w:pPr>
-              <w:spacing w:before="0" w:after="0" w:line="259" w:lineRule="auto"/>
-              <w:jc w:val="left"/>
-            </w:pPr>
-            <w:r>
-              <w:rPr>
-                <w:rFonts w:ascii="Calibri" w:hAnsi="Calibri" w:eastAsia="Malgun Gothic"/>
-                <w:b w:val="0"/>
-                <w:color w:val="222222"/>
-                <w:sz w:val="18"/>
-              </w:rPr>
-              <w:t>페이지와 파일 출처 보존, Windows 중복 glob 방지</w:t>
-            </w:r>
-          </w:p>
-        </w:tc>
-      </w:tr>
-      <w:tr>
-        <w:tc>
-          <w:tcPr>
-            <w:tcW w:type="dxa" w:w="1700"/>
-          </w:tcPr>
-          <w:p>
-            <w:pPr>
-              <w:spacing w:before="0" w:after="0" w:line="259" w:lineRule="auto"/>
-              <w:jc w:val="left"/>
-            </w:pPr>
-            <w:r>
-              <w:rPr>
-                <w:rFonts w:ascii="Calibri" w:hAnsi="Calibri" w:eastAsia="Malgun Gothic"/>
-                <w:b w:val="0"/>
-                <w:color w:val="222222"/>
-                <w:sz w:val="18"/>
-              </w:rPr>
-              <w:t>ingest.py</w:t>
-            </w:r>
-          </w:p>
-        </w:tc>
-        <w:tc>
-          <w:tcPr>
-            <w:tcW w:type="dxa" w:w="2600"/>
-          </w:tcPr>
-          <w:p>
-            <w:pPr>
-              <w:spacing w:before="0" w:after="0" w:line="259" w:lineRule="auto"/>
-              <w:jc w:val="left"/>
-            </w:pPr>
-            <w:r>
-              <w:rPr>
-                <w:rFonts w:ascii="Calibri" w:hAnsi="Calibri" w:eastAsia="Malgun Gothic"/>
-                <w:b w:val="0"/>
-                <w:color w:val="222222"/>
-                <w:sz w:val="18"/>
-              </w:rPr>
-              <w:t>VectorDB 구축</w:t>
-            </w:r>
-          </w:p>
-        </w:tc>
-        <w:tc>
-          <w:tcPr>
-            <w:tcW w:type="dxa" w:w="5060"/>
-          </w:tcPr>
-          <w:p>
-            <w:pPr>
-              <w:spacing w:before="0" w:after="0" w:line="259" w:lineRule="auto"/>
-              <w:jc w:val="left"/>
-            </w:pPr>
-            <w:r>
-              <w:rPr>
-                <w:rFonts w:ascii="Calibri" w:hAnsi="Calibri" w:eastAsia="Malgun Gothic"/>
-                <w:b w:val="0"/>
-                <w:color w:val="222222"/>
-                <w:sz w:val="18"/>
-              </w:rPr>
-              <w:t>안정적 SHA-256 ID로 재인덱싱 시 중복 방지</w:t>
-            </w:r>
-          </w:p>
-        </w:tc>
-      </w:tr>
-      <w:tr>
-        <w:tc>
-          <w:tcPr>
-            <w:tcW w:type="dxa" w:w="1700"/>
-          </w:tcPr>
-          <w:p>
-            <w:pPr>
-              <w:spacing w:before="0" w:after="0" w:line="259" w:lineRule="auto"/>
-              <w:jc w:val="left"/>
-            </w:pPr>
-            <w:r>
-              <w:rPr>
-                <w:rFonts w:ascii="Calibri" w:hAnsi="Calibri" w:eastAsia="Malgun Gothic"/>
-                <w:b w:val="0"/>
-                <w:color w:val="222222"/>
-                <w:sz w:val="18"/>
-              </w:rPr>
-              <w:t>retriever.py</w:t>
-            </w:r>
-          </w:p>
-        </w:tc>
-        <w:tc>
-          <w:tcPr>
-            <w:tcW w:type="dxa" w:w="2600"/>
-          </w:tcPr>
-          <w:p>
-            <w:pPr>
-              <w:spacing w:before="0" w:after="0" w:line="259" w:lineRule="auto"/>
-              <w:jc w:val="left"/>
-            </w:pPr>
-            <w:r>
-              <w:rPr>
-                <w:rFonts w:ascii="Calibri" w:hAnsi="Calibri" w:eastAsia="Malgun Gothic"/>
-                <w:b w:val="0"/>
-                <w:color w:val="222222"/>
-                <w:sz w:val="18"/>
-              </w:rPr>
-              <w:t>유사도 검색</w:t>
-            </w:r>
-          </w:p>
-        </w:tc>
-        <w:tc>
-          <w:tcPr>
-            <w:tcW w:type="dxa" w:w="5060"/>
-          </w:tcPr>
-          <w:p>
-            <w:pPr>
-              <w:spacing w:before="0" w:after="0" w:line="259" w:lineRule="auto"/>
-              <w:jc w:val="left"/>
-            </w:pPr>
-            <w:r>
-              <w:rPr>
-                <w:rFonts w:ascii="Calibri" w:hAnsi="Calibri" w:eastAsia="Malgun Gothic"/>
-                <w:b w:val="0"/>
-                <w:color w:val="222222"/>
-                <w:sz w:val="18"/>
-              </w:rPr>
-              <w:t>학부/대학원 + 공통 문서 메타데이터 필터</w:t>
-            </w:r>
-          </w:p>
-        </w:tc>
-      </w:tr>
-      <w:tr>
-        <w:tc>
-          <w:tcPr>
-            <w:tcW w:type="dxa" w:w="1700"/>
-          </w:tcPr>
-          <w:p>
-            <w:pPr>
-              <w:spacing w:before="0" w:after="0" w:line="259" w:lineRule="auto"/>
-              <w:jc w:val="left"/>
-            </w:pPr>
-            <w:r>
-              <w:rPr>
-                <w:rFonts w:ascii="Calibri" w:hAnsi="Calibri" w:eastAsia="Malgun Gothic"/>
-                <w:b w:val="0"/>
-                <w:color w:val="222222"/>
-                <w:sz w:val="18"/>
-              </w:rPr>
-              <w:t>answerer.py</w:t>
-            </w:r>
-          </w:p>
-        </w:tc>
-        <w:tc>
-          <w:tcPr>
-            <w:tcW w:type="dxa" w:w="2600"/>
-          </w:tcPr>
-          <w:p>
-            <w:pPr>
-              <w:spacing w:before="0" w:after="0" w:line="259" w:lineRule="auto"/>
-              <w:jc w:val="left"/>
-            </w:pPr>
-            <w:r>
-              <w:rPr>
-                <w:rFonts w:ascii="Calibri" w:hAnsi="Calibri" w:eastAsia="Malgun Gothic"/>
-                <w:b w:val="0"/>
-                <w:color w:val="222222"/>
-                <w:sz w:val="18"/>
-              </w:rPr>
-              <w:t>근거 기반 답변</w:t>
-            </w:r>
-          </w:p>
-        </w:tc>
-        <w:tc>
-          <w:tcPr>
-            <w:tcW w:type="dxa" w:w="5060"/>
-          </w:tcPr>
-          <w:p>
-            <w:pPr>
-              <w:spacing w:before="0" w:after="0" w:line="259" w:lineRule="auto"/>
-              <w:jc w:val="left"/>
-            </w:pPr>
-            <w:r>
-              <w:rPr>
-                <w:rFonts w:ascii="Calibri" w:hAnsi="Calibri" w:eastAsia="Malgun Gothic"/>
-                <w:b w:val="0"/>
-                <w:color w:val="222222"/>
-                <w:sz w:val="18"/>
-              </w:rPr>
-              <w:t>동일 언어 응답, 인라인 출처, 빈 문맥 즉시 거절</w:t>
-            </w:r>
-          </w:p>
-        </w:tc>
-      </w:tr>
-      <w:tr>
-        <w:tc>
-          <w:tcPr>
-            <w:tcW w:type="dxa" w:w="1700"/>
-          </w:tcPr>
-          <w:p>
-            <w:pPr>
-              <w:spacing w:before="0" w:after="0" w:line="259" w:lineRule="auto"/>
-              <w:jc w:val="left"/>
-            </w:pPr>
-            <w:r>
-              <w:rPr>
-                <w:rFonts w:ascii="Calibri" w:hAnsi="Calibri" w:eastAsia="Malgun Gothic"/>
-                <w:b w:val="0"/>
-                <w:color w:val="222222"/>
-                <w:sz w:val="18"/>
-              </w:rPr>
-              <w:t>checklist.py</w:t>
-            </w:r>
-          </w:p>
-        </w:tc>
-        <w:tc>
-          <w:tcPr>
-            <w:tcW w:type="dxa" w:w="2600"/>
-          </w:tcPr>
-          <w:p>
-            <w:pPr>
-              <w:spacing w:before="0" w:after="0" w:line="259" w:lineRule="auto"/>
-              <w:jc w:val="left"/>
-            </w:pPr>
-            <w:r>
-              <w:rPr>
-                <w:rFonts w:ascii="Calibri" w:hAnsi="Calibri" w:eastAsia="Malgun Gothic"/>
-                <w:b w:val="0"/>
-                <w:color w:val="222222"/>
-                <w:sz w:val="18"/>
-              </w:rPr>
-              <w:t>맞춤 체크리스트</w:t>
-            </w:r>
-          </w:p>
-        </w:tc>
-        <w:tc>
-          <w:tcPr>
-            <w:tcW w:type="dxa" w:w="5060"/>
-          </w:tcPr>
-          <w:p>
-            <w:pPr>
-              <w:spacing w:before="0" w:after="0" w:line="259" w:lineRule="auto"/>
-              <w:jc w:val="left"/>
-            </w:pPr>
-            <w:r>
-              <w:rPr>
-                <w:rFonts w:ascii="Calibri" w:hAnsi="Calibri" w:eastAsia="Malgun Gothic"/>
-                <w:b w:val="0"/>
-                <w:color w:val="222222"/>
-                <w:sz w:val="18"/>
-              </w:rPr>
-              <w:t>과정·전공·신입/편입·언어를 프롬프트에 반영</w:t>
-            </w:r>
-          </w:p>
-        </w:tc>
-      </w:tr>
-      <w:tr>
-        <w:tc>
-          <w:tcPr>
-            <w:tcW w:type="dxa" w:w="1700"/>
-          </w:tcPr>
-          <w:p>
-            <w:pPr>
-              <w:spacing w:before="0" w:after="0" w:line="259" w:lineRule="auto"/>
-              <w:jc w:val="left"/>
-            </w:pPr>
-            <w:r>
-              <w:rPr>
-                <w:rFonts w:ascii="Calibri" w:hAnsi="Calibri" w:eastAsia="Malgun Gothic"/>
-                <w:b w:val="0"/>
-                <w:color w:val="222222"/>
-                <w:sz w:val="18"/>
-              </w:rPr>
-              <w:t>app.py</w:t>
-            </w:r>
-          </w:p>
-        </w:tc>
-        <w:tc>
-          <w:tcPr>
-            <w:tcW w:type="dxa" w:w="2600"/>
-          </w:tcPr>
-          <w:p>
-            <w:pPr>
-              <w:spacing w:before="0" w:after="0" w:line="259" w:lineRule="auto"/>
-              <w:jc w:val="left"/>
-            </w:pPr>
-            <w:r>
-              <w:rPr>
-                <w:rFonts w:ascii="Calibri" w:hAnsi="Calibri" w:eastAsia="Malgun Gothic"/>
-                <w:b w:val="0"/>
-                <w:color w:val="222222"/>
-                <w:sz w:val="18"/>
-              </w:rPr>
-              <w:t>웹 인터페이스</w:t>
-            </w:r>
-          </w:p>
-        </w:tc>
-        <w:tc>
-          <w:tcPr>
-            <w:tcW w:type="dxa" w:w="5060"/>
-          </w:tcPr>
-          <w:p>
-            <w:pPr>
-              <w:spacing w:before="0" w:after="0" w:line="259" w:lineRule="auto"/>
-              <w:jc w:val="left"/>
-            </w:pPr>
-            <w:r>
-              <w:rPr>
-                <w:rFonts w:ascii="Calibri" w:hAnsi="Calibri" w:eastAsia="Malgun Gothic"/>
-                <w:b w:val="0"/>
-                <w:color w:val="222222"/>
-                <w:sz w:val="18"/>
-              </w:rPr>
-              <w:t>질문 탭과 체크리스트 탭, 오류 메시지와 출처 표시</w:t>
-            </w:r>
-          </w:p>
-        </w:tc>
-      </w:tr>
-    </w:tbl>
-    <w:p>
-      <w:pPr>
-        <w:spacing w:before="0" w:after="60"/>
-      </w:pPr>
-    </w:p>
-    <w:p>
-      <w:pPr>
-        <w:pStyle w:val="Heading2"/>
-      </w:pPr>
-      <w:r>
-        <w:t>2.3 다국어 RAG 전략</w:t>
-      </w:r>
-    </w:p>
-    <w:p>
-      <w:r>
-        <w:t>원문 데이터는 한국어와 영어지만, 다국어 의미 공간을 지원하는 임베딩 모델을 사용해 중국어·베트남어 질문도 관련 한국어/영어 문서로 연결한다. 답변 시에는 시스템 지침으로 사용자의 질문 언어를 유지한다. 즉, 번역 자체가 목적이 아니라 문서 검색, 맥락 결합, 개인화된 정보 구조화가 핵심이다.</w:t>
-      </w:r>
-    </w:p>
-    <w:p>
-      <w:pPr>
-        <w:pStyle w:val="Heading1"/>
-      </w:pPr>
-      <w:r>
-        <w:t>3. 핵심 기능</w:t>
-      </w:r>
-    </w:p>
-    <w:p>
-      <w:pPr>
-        <w:pStyle w:val="Heading2"/>
-      </w:pPr>
-      <w:r>
-        <w:t>3.1 공식 문서 기반 다국어 Q&amp;A</w:t>
-      </w:r>
-    </w:p>
-    <w:p>
-      <w:r>
-        <w:t>사용자가 어느 언어로 질문하더라도 관련 모집요강과 안내서의 상위 문맥을 검색한다. LLM은 제공된 문맥 밖의 날짜, 금액, 자격요건을 만들지 않도록 제한되며, 답변과 별도로 검색에 사용된 파일명 및 페이지 목록을 UI에 표시한다.</w:t>
-      </w:r>
-    </w:p>
-    <w:p>
-      <w:pPr>
-        <w:pStyle w:val="ListBullet"/>
-        <w:ind w:left="720" w:hanging="360"/>
-      </w:pPr>
-      <w:r>
-        <w:t>예시 질문: “What is the application deadline?”</w:t>
-      </w:r>
-    </w:p>
-    <w:p>
-      <w:pPr>
-        <w:pStyle w:val="ListBullet"/>
-        <w:ind w:left="720" w:hanging="360"/>
-      </w:pPr>
-      <w:r>
-        <w:t>예시 질문: “本科申请需要什么材料?”</w:t>
-      </w:r>
-    </w:p>
-    <w:p>
-      <w:pPr>
-        <w:pStyle w:val="ListBullet"/>
-        <w:ind w:left="720" w:hanging="360"/>
-      </w:pPr>
-      <w:r>
-        <w:t>예시 질문: “Cần những giấy tờ gì để nộp hồ sơ?”</w:t>
-      </w:r>
-    </w:p>
-    <w:p>
-      <w:pPr>
-        <w:pStyle w:val="Heading2"/>
-      </w:pPr>
-      <w:r>
-        <w:t>3.2 개인화 제출서류 체크리스트</w:t>
-      </w:r>
-    </w:p>
-    <w:p>
-      <w:r>
-        <w:t>사용자는 학부/대학원, 전공, 신입/편입, 출력 언어를 지정한다. 서비스는 일반 체크리스트와 해당 과정 모집요강을 함께 검색해 번호가 있는 서류 목록을 생성하고, 국적·학력·어학점수에 따라 달라지는 조건을 분리해서 표시한다.</w:t>
-      </w:r>
-    </w:p>
-    <w:p>
-      <w:pPr>
-        <w:pStyle w:val="Heading2"/>
-      </w:pPr>
-      <w:r>
-        <w:t>3.3 신뢰성과 안전장치</w:t>
-      </w:r>
-    </w:p>
-    <w:tbl>
-      <w:tblPr>
-        <w:tblW w:type="dxa" w:w="9360"/>
-        <w:jc w:val="left"/>
-        <w:tblLayout w:type="fixed"/>
-        <w:tblLook w:firstColumn="1" w:firstRow="1" w:lastColumn="0" w:lastRow="0" w:noHBand="0" w:noVBand="1" w:val="04A0"/>
-        <w:tblInd w:w="120" w:type="dxa"/>
-        <w:tblBorders>
-          <w:top w:val="single" w:sz="6" w:space="0" w:color="D8DEE5"/>
-          <w:left w:val="single" w:sz="6" w:space="0" w:color="D8DEE5"/>
-          <w:bottom w:val="single" w:sz="6" w:space="0" w:color="D8DEE5"/>
-          <w:right w:val="single" w:sz="6" w:space="0" w:color="D8DEE5"/>
-          <w:insideH w:val="single" w:sz="6" w:space="0" w:color="D8DEE5"/>
-          <w:insideV w:val="single" w:sz="6" w:space="0" w:color="D8DEE5"/>
-        </w:tblBorders>
-      </w:tblPr>
-      <w:tblGrid>
-        <w:gridCol w:w="2500"/>
-        <w:gridCol w:w="6860"/>
-      </w:tblGrid>
-      <w:tr>
-        <w:trPr>
-          <w:tblHeader w:val="true"/>
-        </w:trPr>
-        <w:tc>
-          <w:tcPr>
-            <w:tcW w:type="dxa" w:w="2500"/>
+            <w:tcW w:type="dxa" w:w="6060"/>
             <w:tcMar>
               <w:top w:w="80" w:type="dxa"/>
               <w:start w:w="120" w:type="dxa"/>
@@ -1761,35 +1236,7 @@
                 <w:color w:val="203748"/>
                 <w:sz w:val="19"/>
               </w:rPr>
-              <w:t>위험</w:t>
-            </w:r>
-          </w:p>
-        </w:tc>
-        <w:tc>
-          <w:tcPr>
-            <w:tcW w:type="dxa" w:w="6860"/>
-            <w:tcMar>
-              <w:top w:w="80" w:type="dxa"/>
-              <w:start w:w="120" w:type="dxa"/>
-              <w:bottom w:w="80" w:type="dxa"/>
-              <w:end w:w="120" w:type="dxa"/>
-            </w:tcMar>
-            <w:vAlign w:val="center"/>
-            <w:shd w:fill="F2F4F7"/>
-          </w:tcPr>
-          <w:p>
-            <w:pPr>
-              <w:spacing w:before="0" w:after="0" w:line="259" w:lineRule="auto"/>
-              <w:jc w:val="left"/>
-            </w:pPr>
-            <w:r>
-              <w:rPr>
-                <w:rFonts w:ascii="Calibri" w:hAnsi="Calibri" w:eastAsia="Malgun Gothic"/>
-                <w:b/>
-                <w:color w:val="203748"/>
-                <w:sz w:val="19"/>
-              </w:rPr>
-              <w:t>대응 방식</w:t>
+              <w:t>결과</w:t>
             </w:r>
           </w:p>
         </w:tc>
@@ -1797,7 +1244,7 @@
       <w:tr>
         <w:tc>
           <w:tcPr>
-            <w:tcW w:type="dxa" w:w="2500"/>
+            <w:tcW w:type="dxa" w:w="3300"/>
           </w:tcPr>
           <w:p>
             <w:pPr>
@@ -1811,13 +1258,13 @@
                 <w:color w:val="222222"/>
                 <w:sz w:val="18"/>
               </w:rPr>
-              <w:t>근거 없는 답변</w:t>
+              <w:t>단위 테스트</w:t>
             </w:r>
           </w:p>
         </w:tc>
         <w:tc>
           <w:tcPr>
-            <w:tcW w:type="dxa" w:w="6860"/>
+            <w:tcW w:type="dxa" w:w="6060"/>
           </w:tcPr>
           <w:p>
             <w:pPr>
@@ -1831,7 +1278,7 @@
                 <w:color w:val="222222"/>
                 <w:sz w:val="18"/>
               </w:rPr>
-              <w:t>검색 문서가 없으면 LLM을 호출하지 않고 입학처 확인 문구 반환</w:t>
+              <w:t>12개 모두 통과</w:t>
             </w:r>
           </w:p>
         </w:tc>
@@ -1839,7 +1286,7 @@
       <w:tr>
         <w:tc>
           <w:tcPr>
-            <w:tcW w:type="dxa" w:w="2500"/>
+            <w:tcW w:type="dxa" w:w="3300"/>
           </w:tcPr>
           <w:p>
             <w:pPr>
@@ -1853,13 +1300,13 @@
                 <w:color w:val="222222"/>
                 <w:sz w:val="18"/>
               </w:rPr>
-              <w:t>잘못된 과정 혼합</w:t>
+              <w:t>Chroma 저장 데이터</w:t>
             </w:r>
           </w:p>
         </w:tc>
         <w:tc>
           <w:tcPr>
-            <w:tcW w:type="dxa" w:w="6860"/>
+            <w:tcW w:type="dxa" w:w="6060"/>
           </w:tcPr>
           <w:p>
             <w:pPr>
@@ -1873,7 +1320,7 @@
                 <w:color w:val="222222"/>
                 <w:sz w:val="18"/>
               </w:rPr>
-              <w:t>학부/대학원 필터와 공통 문서를 함께 검색</w:t>
+              <w:t>64개 벡터 확인</w:t>
             </w:r>
           </w:p>
         </w:tc>
@@ -1881,7 +1328,7 @@
       <w:tr>
         <w:tc>
           <w:tcPr>
-            <w:tcW w:type="dxa" w:w="2500"/>
+            <w:tcW w:type="dxa" w:w="3300"/>
           </w:tcPr>
           <w:p>
             <w:pPr>
@@ -1895,13 +1342,13 @@
                 <w:color w:val="222222"/>
                 <w:sz w:val="18"/>
               </w:rPr>
-              <w:t>출처 불명확</w:t>
+              <w:t>다국어 질문</w:t>
             </w:r>
           </w:p>
         </w:tc>
         <w:tc>
           <w:tcPr>
-            <w:tcW w:type="dxa" w:w="6860"/>
+            <w:tcW w:type="dxa" w:w="6060"/>
           </w:tcPr>
           <w:p>
             <w:pPr>
@@ -1915,7 +1362,7 @@
                 <w:color w:val="222222"/>
                 <w:sz w:val="18"/>
               </w:rPr>
-              <w:t>파일명·페이지를 문맥과 UI에 모두 표시</w:t>
+              <w:t>한국어·영어·중국어·베트남어 4개 질문 통과</w:t>
             </w:r>
           </w:p>
         </w:tc>
@@ -1923,7 +1370,7 @@
       <w:tr>
         <w:tc>
           <w:tcPr>
-            <w:tcW w:type="dxa" w:w="2500"/>
+            <w:tcW w:type="dxa" w:w="3300"/>
           </w:tcPr>
           <w:p>
             <w:pPr>
@@ -1937,13 +1384,13 @@
                 <w:color w:val="222222"/>
                 <w:sz w:val="18"/>
               </w:rPr>
-              <w:t>인덱스 중복</w:t>
+              <w:t>로컬 Streamlit</w:t>
             </w:r>
           </w:p>
         </w:tc>
         <w:tc>
           <w:tcPr>
-            <w:tcW w:type="dxa" w:w="6860"/>
+            <w:tcW w:type="dxa" w:w="6060"/>
           </w:tcPr>
           <w:p>
             <w:pPr>
@@ -1957,7 +1404,7 @@
                 <w:color w:val="222222"/>
                 <w:sz w:val="18"/>
               </w:rPr>
-              <w:t>문서 내용 기반 해시 ID를 사용한 멱등적 ingest</w:t>
+              <w:t>헬스 체크 HTTP 200</w:t>
             </w:r>
           </w:p>
         </w:tc>
@@ -1965,7 +1412,7 @@
       <w:tr>
         <w:tc>
           <w:tcPr>
-            <w:tcW w:type="dxa" w:w="2500"/>
+            <w:tcW w:type="dxa" w:w="3300"/>
           </w:tcPr>
           <w:p>
             <w:pPr>
@@ -1979,13 +1426,13 @@
                 <w:color w:val="222222"/>
                 <w:sz w:val="18"/>
               </w:rPr>
-              <w:t>비밀키 노출</w:t>
+              <w:t>공개 웹 서비스</w:t>
             </w:r>
           </w:p>
         </w:tc>
         <w:tc>
           <w:tcPr>
-            <w:tcW w:type="dxa" w:w="6860"/>
+            <w:tcW w:type="dxa" w:w="6060"/>
           </w:tcPr>
           <w:p>
             <w:pPr>
@@ -1999,7 +1446,7 @@
                 <w:color w:val="222222"/>
                 <w:sz w:val="18"/>
               </w:rPr>
-              <w:t>.env/API_key.txt를 gitignore 처리하고 배포 Secrets 사용</w:t>
+              <w:t>실제 질문 답변과 PDF 파일명·페이지 표시 확인</w:t>
             </w:r>
           </w:p>
         </w:tc>
@@ -2011,60 +1458,8 @@
       </w:pPr>
     </w:p>
     <w:p>
-      <w:pPr>
-        <w:pStyle w:val="Heading2"/>
-      </w:pPr>
       <w:r>
-        <w:t>3.4 웹 사용자 경험</w:t>
-      </w:r>
-    </w:p>
-    <w:p>
-      <w:pPr>
-        <w:pStyle w:val="ListBullet"/>
-        <w:ind w:left="720" w:hanging="360"/>
-      </w:pPr>
-      <w:r>
-        <w:t>Ask a question: 자연어 질문 입력 → 공식 문서 검색 → 다국어 답변 및 출처 표시</w:t>
-      </w:r>
-    </w:p>
-    <w:p>
-      <w:pPr>
-        <w:pStyle w:val="ListBullet"/>
-        <w:ind w:left="720" w:hanging="360"/>
-      </w:pPr>
-      <w:r>
-        <w:t>My document checklist: 지원자 조건 입력 → 개인화된 번호 목록 생성</w:t>
-      </w:r>
-    </w:p>
-    <w:p>
-      <w:pPr>
-        <w:pStyle w:val="ListBullet"/>
-        <w:ind w:left="720" w:hanging="360"/>
-      </w:pPr>
-      <w:r>
-        <w:t>API 키 미설정 및 실행 오류를 사용자가 이해할 수 있는 메시지로 표시</w:t>
-      </w:r>
-    </w:p>
-    <w:p>
-      <w:pPr>
-        <w:pStyle w:val="ListBullet"/>
-        <w:ind w:left="720" w:hanging="360"/>
-      </w:pPr>
-      <w:r>
-        <w:t>Streamlit 테마 설정으로 정보 중심의 일관된 화면 구성</w:t>
-      </w:r>
-    </w:p>
-    <w:p>
-      <w:pPr>
-        <w:pStyle w:val="Heading2"/>
-      </w:pPr>
-      <w:r>
-        <w:t>3.5 Claude Code 활용</w:t>
-      </w:r>
-    </w:p>
-    <w:p>
-      <w:r>
-        <w:t>Claude Code 기반 AI 코딩 워크플로를 활용해 요구사항을 구현 단위로 분해하고, 모듈별 인터페이스와 테스트를 먼저 정의한 뒤 구현·검증을 반복했다. PDF 중복 처리와 같은 Windows 환경 문제를 테스트 과정에서 발견해 수정했고, 배포 전 비밀키·git 상태·웹 헬스 체크를 점검하는 방식으로 개발 품질을 관리했다.</w:t>
+        <w:t>다국어 평가는 아직 4개 질문만 사용한 간단한 확인용 테스트다. 마감일이나 등록금처럼 정답을 정확히 비교해야 하는 질문을 더 추가하면 서비스 품질을 더 제대로 평가할 수 있다.</w:t>
       </w:r>
     </w:p>
     <w:p>
@@ -2072,993 +1467,12 @@
         <w:pStyle w:val="Heading1"/>
       </w:pPr>
       <w:r>
-        <w:t>4. 테스트 및 평가</w:t>
-      </w:r>
-    </w:p>
-    <w:p>
-      <w:pPr>
-        <w:spacing w:before="100" w:after="240" w:line="276" w:lineRule="auto"/>
-        <w:ind w:left="259" w:right="173"/>
-        <w:shd w:fill="EEF5FB"/>
-        <w:pBdr>
-          <w:left w:val="single" w:sz="18" w:space="10" w:color="2E74B5"/>
-        </w:pBdr>
-      </w:pPr>
-      <w:r>
-        <w:rPr>
-          <w:rFonts w:ascii="Calibri" w:hAnsi="Calibri" w:eastAsia="Malgun Gothic"/>
-          <w:b/>
-          <w:color w:val="1F4D78"/>
-          <w:sz w:val="22"/>
-        </w:rPr>
-        <w:t xml:space="preserve">검증 결과  </w:t>
-      </w:r>
-      <w:r>
-        <w:rPr>
-          <w:rFonts w:ascii="Calibri" w:hAnsi="Calibri" w:eastAsia="Malgun Gothic"/>
-          <w:color w:val="222222"/>
-          <w:sz w:val="22"/>
-        </w:rPr>
-        <w:t>단위 테스트 12개와 한국어·영어·중국어·베트남어 라이브 평가 4개를 모두 통과했으며, Streamlit 로컬 헬스 엔드포인트에서 HTTP 200을 확인했다.</w:t>
-      </w:r>
-    </w:p>
-    <w:p>
-      <w:pPr>
-        <w:pStyle w:val="Heading2"/>
-      </w:pPr>
-      <w:r>
-        <w:t>4.1 단위 테스트</w:t>
-      </w:r>
-    </w:p>
-    <w:tbl>
-      <w:tblPr>
-        <w:tblW w:type="dxa" w:w="9360"/>
-        <w:jc w:val="left"/>
-        <w:tblLayout w:type="fixed"/>
-        <w:tblLook w:firstColumn="1" w:firstRow="1" w:lastColumn="0" w:lastRow="0" w:noHBand="0" w:noVBand="1" w:val="04A0"/>
-        <w:tblInd w:w="120" w:type="dxa"/>
-        <w:tblBorders>
-          <w:top w:val="single" w:sz="6" w:space="0" w:color="D8DEE5"/>
-          <w:left w:val="single" w:sz="6" w:space="0" w:color="D8DEE5"/>
-          <w:bottom w:val="single" w:sz="6" w:space="0" w:color="D8DEE5"/>
-          <w:right w:val="single" w:sz="6" w:space="0" w:color="D8DEE5"/>
-          <w:insideH w:val="single" w:sz="6" w:space="0" w:color="D8DEE5"/>
-          <w:insideV w:val="single" w:sz="6" w:space="0" w:color="D8DEE5"/>
-        </w:tblBorders>
-      </w:tblPr>
-      <w:tblGrid>
-        <w:gridCol w:w="2000"/>
-        <w:gridCol w:w="5860"/>
-        <w:gridCol w:w="1500"/>
-      </w:tblGrid>
-      <w:tr>
-        <w:trPr>
-          <w:tblHeader w:val="true"/>
-        </w:trPr>
-        <w:tc>
-          <w:tcPr>
-            <w:tcW w:type="dxa" w:w="2000"/>
-            <w:tcMar>
-              <w:top w:w="80" w:type="dxa"/>
-              <w:start w:w="120" w:type="dxa"/>
-              <w:bottom w:w="80" w:type="dxa"/>
-              <w:end w:w="120" w:type="dxa"/>
-            </w:tcMar>
-            <w:vAlign w:val="center"/>
-            <w:shd w:fill="F2F4F7"/>
-          </w:tcPr>
-          <w:p>
-            <w:pPr>
-              <w:spacing w:before="0" w:after="0" w:line="259" w:lineRule="auto"/>
-              <w:jc w:val="left"/>
-            </w:pPr>
-            <w:r>
-              <w:rPr>
-                <w:rFonts w:ascii="Calibri" w:hAnsi="Calibri" w:eastAsia="Malgun Gothic"/>
-                <w:b/>
-                <w:color w:val="203748"/>
-                <w:sz w:val="19"/>
-              </w:rPr>
-              <w:t>검증 영역</w:t>
-            </w:r>
-          </w:p>
-        </w:tc>
-        <w:tc>
-          <w:tcPr>
-            <w:tcW w:type="dxa" w:w="5860"/>
-            <w:tcMar>
-              <w:top w:w="80" w:type="dxa"/>
-              <w:start w:w="120" w:type="dxa"/>
-              <w:bottom w:w="80" w:type="dxa"/>
-              <w:end w:w="120" w:type="dxa"/>
-            </w:tcMar>
-            <w:vAlign w:val="center"/>
-            <w:shd w:fill="F2F4F7"/>
-          </w:tcPr>
-          <w:p>
-            <w:pPr>
-              <w:spacing w:before="0" w:after="0" w:line="259" w:lineRule="auto"/>
-              <w:jc w:val="left"/>
-            </w:pPr>
-            <w:r>
-              <w:rPr>
-                <w:rFonts w:ascii="Calibri" w:hAnsi="Calibri" w:eastAsia="Malgun Gothic"/>
-                <w:b/>
-                <w:color w:val="203748"/>
-                <w:sz w:val="19"/>
-              </w:rPr>
-              <w:t>주요 확인 항목</w:t>
-            </w:r>
-          </w:p>
-        </w:tc>
-        <w:tc>
-          <w:tcPr>
-            <w:tcW w:type="dxa" w:w="1500"/>
-            <w:tcMar>
-              <w:top w:w="80" w:type="dxa"/>
-              <w:start w:w="120" w:type="dxa"/>
-              <w:bottom w:w="80" w:type="dxa"/>
-              <w:end w:w="120" w:type="dxa"/>
-            </w:tcMar>
-            <w:vAlign w:val="center"/>
-            <w:shd w:fill="F2F4F7"/>
-          </w:tcPr>
-          <w:p>
-            <w:pPr>
-              <w:spacing w:before="0" w:after="0" w:line="259" w:lineRule="auto"/>
-              <w:jc w:val="center"/>
-            </w:pPr>
-            <w:r>
-              <w:rPr>
-                <w:rFonts w:ascii="Calibri" w:hAnsi="Calibri" w:eastAsia="Malgun Gothic"/>
-                <w:b/>
-                <w:color w:val="203748"/>
-                <w:sz w:val="19"/>
-              </w:rPr>
-              <w:t>결과</w:t>
-            </w:r>
-          </w:p>
-        </w:tc>
-      </w:tr>
-      <w:tr>
-        <w:tc>
-          <w:tcPr>
-            <w:tcW w:type="dxa" w:w="2000"/>
-          </w:tcPr>
-          <w:p>
-            <w:pPr>
-              <w:spacing w:before="0" w:after="0" w:line="259" w:lineRule="auto"/>
-              <w:jc w:val="left"/>
-            </w:pPr>
-            <w:r>
-              <w:rPr>
-                <w:rFonts w:ascii="Calibri" w:hAnsi="Calibri" w:eastAsia="Malgun Gothic"/>
-                <w:b w:val="0"/>
-                <w:color w:val="222222"/>
-                <w:sz w:val="18"/>
-              </w:rPr>
-              <w:t>설정</w:t>
-            </w:r>
-          </w:p>
-        </w:tc>
-        <w:tc>
-          <w:tcPr>
-            <w:tcW w:type="dxa" w:w="5860"/>
-          </w:tcPr>
-          <w:p>
-            <w:pPr>
-              <w:spacing w:before="0" w:after="0" w:line="259" w:lineRule="auto"/>
-              <w:jc w:val="left"/>
-            </w:pPr>
-            <w:r>
-              <w:rPr>
-                <w:rFonts w:ascii="Calibri" w:hAnsi="Calibri" w:eastAsia="Malgun Gothic"/>
-                <w:b w:val="0"/>
-                <w:color w:val="222222"/>
-                <w:sz w:val="18"/>
-              </w:rPr>
-              <w:t>모델명, 언어/과정 파일명 분류</w:t>
-            </w:r>
-          </w:p>
-        </w:tc>
-        <w:tc>
-          <w:tcPr>
-            <w:tcW w:type="dxa" w:w="1500"/>
-          </w:tcPr>
-          <w:p>
-            <w:pPr>
-              <w:spacing w:before="0" w:after="0" w:line="259" w:lineRule="auto"/>
-              <w:jc w:val="center"/>
-            </w:pPr>
-            <w:r>
-              <w:rPr>
-                <w:rFonts w:ascii="Calibri" w:hAnsi="Calibri" w:eastAsia="Malgun Gothic"/>
-                <w:b w:val="0"/>
-                <w:color w:val="222222"/>
-                <w:sz w:val="18"/>
-              </w:rPr>
-              <w:t>3/3</w:t>
-            </w:r>
-          </w:p>
-        </w:tc>
-      </w:tr>
-      <w:tr>
-        <w:tc>
-          <w:tcPr>
-            <w:tcW w:type="dxa" w:w="2000"/>
-          </w:tcPr>
-          <w:p>
-            <w:pPr>
-              <w:spacing w:before="0" w:after="0" w:line="259" w:lineRule="auto"/>
-              <w:jc w:val="left"/>
-            </w:pPr>
-            <w:r>
-              <w:rPr>
-                <w:rFonts w:ascii="Calibri" w:hAnsi="Calibri" w:eastAsia="Malgun Gothic"/>
-                <w:b w:val="0"/>
-                <w:color w:val="222222"/>
-                <w:sz w:val="18"/>
-              </w:rPr>
-              <w:t>PDF 추출</w:t>
-            </w:r>
-          </w:p>
-        </w:tc>
-        <w:tc>
-          <w:tcPr>
-            <w:tcW w:type="dxa" w:w="5860"/>
-          </w:tcPr>
-          <w:p>
-            <w:pPr>
-              <w:spacing w:before="0" w:after="0" w:line="259" w:lineRule="auto"/>
-              <w:jc w:val="left"/>
-            </w:pPr>
-            <w:r>
-              <w:rPr>
-                <w:rFonts w:ascii="Calibri" w:hAnsi="Calibri" w:eastAsia="Malgun Gothic"/>
-                <w:b w:val="0"/>
-                <w:color w:val="222222"/>
-                <w:sz w:val="18"/>
-              </w:rPr>
-              <w:t>청크 크기, 짧은 문서, 실제 메타데이터</w:t>
-            </w:r>
-          </w:p>
-        </w:tc>
-        <w:tc>
-          <w:tcPr>
-            <w:tcW w:type="dxa" w:w="1500"/>
-          </w:tcPr>
-          <w:p>
-            <w:pPr>
-              <w:spacing w:before="0" w:after="0" w:line="259" w:lineRule="auto"/>
-              <w:jc w:val="center"/>
-            </w:pPr>
-            <w:r>
-              <w:rPr>
-                <w:rFonts w:ascii="Calibri" w:hAnsi="Calibri" w:eastAsia="Malgun Gothic"/>
-                <w:b w:val="0"/>
-                <w:color w:val="222222"/>
-                <w:sz w:val="18"/>
-              </w:rPr>
-              <w:t>3/3</w:t>
-            </w:r>
-          </w:p>
-        </w:tc>
-      </w:tr>
-      <w:tr>
-        <w:tc>
-          <w:tcPr>
-            <w:tcW w:type="dxa" w:w="2000"/>
-          </w:tcPr>
-          <w:p>
-            <w:pPr>
-              <w:spacing w:before="0" w:after="0" w:line="259" w:lineRule="auto"/>
-              <w:jc w:val="left"/>
-            </w:pPr>
-            <w:r>
-              <w:rPr>
-                <w:rFonts w:ascii="Calibri" w:hAnsi="Calibri" w:eastAsia="Malgun Gothic"/>
-                <w:b w:val="0"/>
-                <w:color w:val="222222"/>
-                <w:sz w:val="18"/>
-              </w:rPr>
-              <w:t>Answerer</w:t>
-            </w:r>
-          </w:p>
-        </w:tc>
-        <w:tc>
-          <w:tcPr>
-            <w:tcW w:type="dxa" w:w="5860"/>
-          </w:tcPr>
-          <w:p>
-            <w:pPr>
-              <w:spacing w:before="0" w:after="0" w:line="259" w:lineRule="auto"/>
-              <w:jc w:val="left"/>
-            </w:pPr>
-            <w:r>
-              <w:rPr>
-                <w:rFonts w:ascii="Calibri" w:hAnsi="Calibri" w:eastAsia="Malgun Gothic"/>
-                <w:b w:val="0"/>
-                <w:color w:val="222222"/>
-                <w:sz w:val="18"/>
-              </w:rPr>
-              <w:t>빈 문맥 무호출 거절, 출처 포맷</w:t>
-            </w:r>
-          </w:p>
-        </w:tc>
-        <w:tc>
-          <w:tcPr>
-            <w:tcW w:type="dxa" w:w="1500"/>
-          </w:tcPr>
-          <w:p>
-            <w:pPr>
-              <w:spacing w:before="0" w:after="0" w:line="259" w:lineRule="auto"/>
-              <w:jc w:val="center"/>
-            </w:pPr>
-            <w:r>
-              <w:rPr>
-                <w:rFonts w:ascii="Calibri" w:hAnsi="Calibri" w:eastAsia="Malgun Gothic"/>
-                <w:b w:val="0"/>
-                <w:color w:val="222222"/>
-                <w:sz w:val="18"/>
-              </w:rPr>
-              <w:t>2/2</w:t>
-            </w:r>
-          </w:p>
-        </w:tc>
-      </w:tr>
-      <w:tr>
-        <w:tc>
-          <w:tcPr>
-            <w:tcW w:type="dxa" w:w="2000"/>
-          </w:tcPr>
-          <w:p>
-            <w:pPr>
-              <w:spacing w:before="0" w:after="0" w:line="259" w:lineRule="auto"/>
-              <w:jc w:val="left"/>
-            </w:pPr>
-            <w:r>
-              <w:rPr>
-                <w:rFonts w:ascii="Calibri" w:hAnsi="Calibri" w:eastAsia="Malgun Gothic"/>
-                <w:b w:val="0"/>
-                <w:color w:val="222222"/>
-                <w:sz w:val="18"/>
-              </w:rPr>
-              <w:t>Checklist</w:t>
-            </w:r>
-          </w:p>
-        </w:tc>
-        <w:tc>
-          <w:tcPr>
-            <w:tcW w:type="dxa" w:w="5860"/>
-          </w:tcPr>
-          <w:p>
-            <w:pPr>
-              <w:spacing w:before="0" w:after="0" w:line="259" w:lineRule="auto"/>
-              <w:jc w:val="left"/>
-            </w:pPr>
-            <w:r>
-              <w:rPr>
-                <w:rFonts w:ascii="Calibri" w:hAnsi="Calibri" w:eastAsia="Malgun Gothic"/>
-                <w:b w:val="0"/>
-                <w:color w:val="222222"/>
-                <w:sz w:val="18"/>
-              </w:rPr>
-              <w:t>검색 결과 없음 시 안전한 거절</w:t>
-            </w:r>
-          </w:p>
-        </w:tc>
-        <w:tc>
-          <w:tcPr>
-            <w:tcW w:type="dxa" w:w="1500"/>
-          </w:tcPr>
-          <w:p>
-            <w:pPr>
-              <w:spacing w:before="0" w:after="0" w:line="259" w:lineRule="auto"/>
-              <w:jc w:val="center"/>
-            </w:pPr>
-            <w:r>
-              <w:rPr>
-                <w:rFonts w:ascii="Calibri" w:hAnsi="Calibri" w:eastAsia="Malgun Gothic"/>
-                <w:b w:val="0"/>
-                <w:color w:val="222222"/>
-                <w:sz w:val="18"/>
-              </w:rPr>
-              <w:t>1/1</w:t>
-            </w:r>
-          </w:p>
-        </w:tc>
-      </w:tr>
-      <w:tr>
-        <w:tc>
-          <w:tcPr>
-            <w:tcW w:type="dxa" w:w="2000"/>
-          </w:tcPr>
-          <w:p>
-            <w:pPr>
-              <w:spacing w:before="0" w:after="0" w:line="259" w:lineRule="auto"/>
-              <w:jc w:val="left"/>
-            </w:pPr>
-            <w:r>
-              <w:rPr>
-                <w:rFonts w:ascii="Calibri" w:hAnsi="Calibri" w:eastAsia="Malgun Gothic"/>
-                <w:b w:val="0"/>
-                <w:color w:val="222222"/>
-                <w:sz w:val="18"/>
-              </w:rPr>
-              <w:t>Ingest</w:t>
-            </w:r>
-          </w:p>
-        </w:tc>
-        <w:tc>
-          <w:tcPr>
-            <w:tcW w:type="dxa" w:w="5860"/>
-          </w:tcPr>
-          <w:p>
-            <w:pPr>
-              <w:spacing w:before="0" w:after="0" w:line="259" w:lineRule="auto"/>
-              <w:jc w:val="left"/>
-            </w:pPr>
-            <w:r>
-              <w:rPr>
-                <w:rFonts w:ascii="Calibri" w:hAnsi="Calibri" w:eastAsia="Malgun Gothic"/>
-                <w:b w:val="0"/>
-                <w:color w:val="222222"/>
-                <w:sz w:val="18"/>
-              </w:rPr>
-              <w:t>안정적이고 내용 민감한 문서 ID</w:t>
-            </w:r>
-          </w:p>
-        </w:tc>
-        <w:tc>
-          <w:tcPr>
-            <w:tcW w:type="dxa" w:w="1500"/>
-          </w:tcPr>
-          <w:p>
-            <w:pPr>
-              <w:spacing w:before="0" w:after="0" w:line="259" w:lineRule="auto"/>
-              <w:jc w:val="center"/>
-            </w:pPr>
-            <w:r>
-              <w:rPr>
-                <w:rFonts w:ascii="Calibri" w:hAnsi="Calibri" w:eastAsia="Malgun Gothic"/>
-                <w:b w:val="0"/>
-                <w:color w:val="222222"/>
-                <w:sz w:val="18"/>
-              </w:rPr>
-              <w:t>1/1</w:t>
-            </w:r>
-          </w:p>
-        </w:tc>
-      </w:tr>
-      <w:tr>
-        <w:tc>
-          <w:tcPr>
-            <w:tcW w:type="dxa" w:w="2000"/>
-          </w:tcPr>
-          <w:p>
-            <w:pPr>
-              <w:spacing w:before="0" w:after="0" w:line="259" w:lineRule="auto"/>
-              <w:jc w:val="left"/>
-            </w:pPr>
-            <w:r>
-              <w:rPr>
-                <w:rFonts w:ascii="Calibri" w:hAnsi="Calibri" w:eastAsia="Malgun Gothic"/>
-                <w:b w:val="0"/>
-                <w:color w:val="222222"/>
-                <w:sz w:val="18"/>
-              </w:rPr>
-              <w:t>Retriever</w:t>
-            </w:r>
-          </w:p>
-        </w:tc>
-        <w:tc>
-          <w:tcPr>
-            <w:tcW w:type="dxa" w:w="5860"/>
-          </w:tcPr>
-          <w:p>
-            <w:pPr>
-              <w:spacing w:before="0" w:after="0" w:line="259" w:lineRule="auto"/>
-              <w:jc w:val="left"/>
-            </w:pPr>
-            <w:r>
-              <w:rPr>
-                <w:rFonts w:ascii="Calibri" w:hAnsi="Calibri" w:eastAsia="Malgun Gothic"/>
-                <w:b w:val="0"/>
-                <w:color w:val="222222"/>
-                <w:sz w:val="18"/>
-              </w:rPr>
-              <w:t>빈 질문 처리, 과정+공통 문서 필터</w:t>
-            </w:r>
-          </w:p>
-        </w:tc>
-        <w:tc>
-          <w:tcPr>
-            <w:tcW w:type="dxa" w:w="1500"/>
-          </w:tcPr>
-          <w:p>
-            <w:pPr>
-              <w:spacing w:before="0" w:after="0" w:line="259" w:lineRule="auto"/>
-              <w:jc w:val="center"/>
-            </w:pPr>
-            <w:r>
-              <w:rPr>
-                <w:rFonts w:ascii="Calibri" w:hAnsi="Calibri" w:eastAsia="Malgun Gothic"/>
-                <w:b w:val="0"/>
-                <w:color w:val="222222"/>
-                <w:sz w:val="18"/>
-              </w:rPr>
-              <w:t>2/2</w:t>
-            </w:r>
-          </w:p>
-        </w:tc>
-      </w:tr>
-    </w:tbl>
-    <w:p>
-      <w:pPr>
-        <w:spacing w:before="0" w:after="60"/>
-      </w:pPr>
-    </w:p>
-    <w:p>
-      <w:pPr>
-        <w:pStyle w:val="Heading2"/>
-      </w:pPr>
-      <w:r>
-        <w:t>4.2 다국어 라이브 평가</w:t>
-      </w:r>
-    </w:p>
-    <w:tbl>
-      <w:tblPr>
-        <w:tblW w:type="dxa" w:w="9360"/>
-        <w:jc w:val="left"/>
-        <w:tblLayout w:type="fixed"/>
-        <w:tblLook w:firstColumn="1" w:firstRow="1" w:lastColumn="0" w:lastRow="0" w:noHBand="0" w:noVBand="1" w:val="04A0"/>
-        <w:tblInd w:w="120" w:type="dxa"/>
-        <w:tblBorders>
-          <w:top w:val="single" w:sz="6" w:space="0" w:color="D8DEE5"/>
-          <w:left w:val="single" w:sz="6" w:space="0" w:color="D8DEE5"/>
-          <w:bottom w:val="single" w:sz="6" w:space="0" w:color="D8DEE5"/>
-          <w:right w:val="single" w:sz="6" w:space="0" w:color="D8DEE5"/>
-          <w:insideH w:val="single" w:sz="6" w:space="0" w:color="D8DEE5"/>
-          <w:insideV w:val="single" w:sz="6" w:space="0" w:color="D8DEE5"/>
-        </w:tblBorders>
-      </w:tblPr>
-      <w:tblGrid>
-        <w:gridCol w:w="1500"/>
-        <w:gridCol w:w="6360"/>
-        <w:gridCol w:w="1500"/>
-      </w:tblGrid>
-      <w:tr>
-        <w:trPr>
-          <w:tblHeader w:val="true"/>
-        </w:trPr>
-        <w:tc>
-          <w:tcPr>
-            <w:tcW w:type="dxa" w:w="1500"/>
-            <w:tcMar>
-              <w:top w:w="80" w:type="dxa"/>
-              <w:start w:w="120" w:type="dxa"/>
-              <w:bottom w:w="80" w:type="dxa"/>
-              <w:end w:w="120" w:type="dxa"/>
-            </w:tcMar>
-            <w:vAlign w:val="center"/>
-            <w:shd w:fill="F2F4F7"/>
-          </w:tcPr>
-          <w:p>
-            <w:pPr>
-              <w:spacing w:before="0" w:after="0" w:line="259" w:lineRule="auto"/>
-              <w:jc w:val="center"/>
-            </w:pPr>
-            <w:r>
-              <w:rPr>
-                <w:rFonts w:ascii="Calibri" w:hAnsi="Calibri" w:eastAsia="Malgun Gothic"/>
-                <w:b/>
-                <w:color w:val="203748"/>
-                <w:sz w:val="19"/>
-              </w:rPr>
-              <w:t>언어</w:t>
-            </w:r>
-          </w:p>
-        </w:tc>
-        <w:tc>
-          <w:tcPr>
-            <w:tcW w:type="dxa" w:w="6360"/>
-            <w:tcMar>
-              <w:top w:w="80" w:type="dxa"/>
-              <w:start w:w="120" w:type="dxa"/>
-              <w:bottom w:w="80" w:type="dxa"/>
-              <w:end w:w="120" w:type="dxa"/>
-            </w:tcMar>
-            <w:vAlign w:val="center"/>
-            <w:shd w:fill="F2F4F7"/>
-          </w:tcPr>
-          <w:p>
-            <w:pPr>
-              <w:spacing w:before="0" w:after="0" w:line="259" w:lineRule="auto"/>
-              <w:jc w:val="left"/>
-            </w:pPr>
-            <w:r>
-              <w:rPr>
-                <w:rFonts w:ascii="Calibri" w:hAnsi="Calibri" w:eastAsia="Malgun Gothic"/>
-                <w:b/>
-                <w:color w:val="203748"/>
-                <w:sz w:val="19"/>
-              </w:rPr>
-              <w:t>질문 예시</w:t>
-            </w:r>
-          </w:p>
-        </w:tc>
-        <w:tc>
-          <w:tcPr>
-            <w:tcW w:type="dxa" w:w="1500"/>
-            <w:tcMar>
-              <w:top w:w="80" w:type="dxa"/>
-              <w:start w:w="120" w:type="dxa"/>
-              <w:bottom w:w="80" w:type="dxa"/>
-              <w:end w:w="120" w:type="dxa"/>
-            </w:tcMar>
-            <w:vAlign w:val="center"/>
-            <w:shd w:fill="F2F4F7"/>
-          </w:tcPr>
-          <w:p>
-            <w:pPr>
-              <w:spacing w:before="0" w:after="0" w:line="259" w:lineRule="auto"/>
-              <w:jc w:val="center"/>
-            </w:pPr>
-            <w:r>
-              <w:rPr>
-                <w:rFonts w:ascii="Calibri" w:hAnsi="Calibri" w:eastAsia="Malgun Gothic"/>
-                <w:b/>
-                <w:color w:val="203748"/>
-                <w:sz w:val="19"/>
-              </w:rPr>
-              <w:t>판정</w:t>
-            </w:r>
-          </w:p>
-        </w:tc>
-      </w:tr>
-      <w:tr>
-        <w:tc>
-          <w:tcPr>
-            <w:tcW w:type="dxa" w:w="1500"/>
-          </w:tcPr>
-          <w:p>
-            <w:pPr>
-              <w:spacing w:before="0" w:after="0" w:line="259" w:lineRule="auto"/>
-              <w:jc w:val="center"/>
-            </w:pPr>
-            <w:r>
-              <w:rPr>
-                <w:rFonts w:ascii="Calibri" w:hAnsi="Calibri" w:eastAsia="Malgun Gothic"/>
-                <w:b w:val="0"/>
-                <w:color w:val="222222"/>
-                <w:sz w:val="18"/>
-              </w:rPr>
-              <w:t>한국어</w:t>
-            </w:r>
-          </w:p>
-        </w:tc>
-        <w:tc>
-          <w:tcPr>
-            <w:tcW w:type="dxa" w:w="6360"/>
-          </w:tcPr>
-          <w:p>
-            <w:pPr>
-              <w:spacing w:before="0" w:after="0" w:line="259" w:lineRule="auto"/>
-              <w:jc w:val="left"/>
-            </w:pPr>
-            <w:r>
-              <w:rPr>
-                <w:rFonts w:ascii="Calibri" w:hAnsi="Calibri" w:eastAsia="Malgun Gothic"/>
-                <w:b w:val="0"/>
-                <w:color w:val="222222"/>
-                <w:sz w:val="18"/>
-              </w:rPr>
-              <w:t>무슨 서류를 제출해야 하나요?</w:t>
-            </w:r>
-          </w:p>
-        </w:tc>
-        <w:tc>
-          <w:tcPr>
-            <w:tcW w:type="dxa" w:w="1500"/>
-          </w:tcPr>
-          <w:p>
-            <w:pPr>
-              <w:spacing w:before="0" w:after="0" w:line="259" w:lineRule="auto"/>
-              <w:jc w:val="center"/>
-            </w:pPr>
-            <w:r>
-              <w:rPr>
-                <w:rFonts w:ascii="Calibri" w:hAnsi="Calibri" w:eastAsia="Malgun Gothic"/>
-                <w:b w:val="0"/>
-                <w:color w:val="222222"/>
-                <w:sz w:val="18"/>
-              </w:rPr>
-              <w:t>PASS</w:t>
-            </w:r>
-          </w:p>
-        </w:tc>
-      </w:tr>
-      <w:tr>
-        <w:tc>
-          <w:tcPr>
-            <w:tcW w:type="dxa" w:w="1500"/>
-          </w:tcPr>
-          <w:p>
-            <w:pPr>
-              <w:spacing w:before="0" w:after="0" w:line="259" w:lineRule="auto"/>
-              <w:jc w:val="center"/>
-            </w:pPr>
-            <w:r>
-              <w:rPr>
-                <w:rFonts w:ascii="Calibri" w:hAnsi="Calibri" w:eastAsia="Malgun Gothic"/>
-                <w:b w:val="0"/>
-                <w:color w:val="222222"/>
-                <w:sz w:val="18"/>
-              </w:rPr>
-              <w:t>영어</w:t>
-            </w:r>
-          </w:p>
-        </w:tc>
-        <w:tc>
-          <w:tcPr>
-            <w:tcW w:type="dxa" w:w="6360"/>
-          </w:tcPr>
-          <w:p>
-            <w:pPr>
-              <w:spacing w:before="0" w:after="0" w:line="259" w:lineRule="auto"/>
-              <w:jc w:val="left"/>
-            </w:pPr>
-            <w:r>
-              <w:rPr>
-                <w:rFonts w:ascii="Calibri" w:hAnsi="Calibri" w:eastAsia="Malgun Gothic"/>
-                <w:b w:val="0"/>
-                <w:color w:val="222222"/>
-                <w:sz w:val="18"/>
-              </w:rPr>
-              <w:t>What is the application deadline?</w:t>
-            </w:r>
-          </w:p>
-        </w:tc>
-        <w:tc>
-          <w:tcPr>
-            <w:tcW w:type="dxa" w:w="1500"/>
-          </w:tcPr>
-          <w:p>
-            <w:pPr>
-              <w:spacing w:before="0" w:after="0" w:line="259" w:lineRule="auto"/>
-              <w:jc w:val="center"/>
-            </w:pPr>
-            <w:r>
-              <w:rPr>
-                <w:rFonts w:ascii="Calibri" w:hAnsi="Calibri" w:eastAsia="Malgun Gothic"/>
-                <w:b w:val="0"/>
-                <w:color w:val="222222"/>
-                <w:sz w:val="18"/>
-              </w:rPr>
-              <w:t>PASS</w:t>
-            </w:r>
-          </w:p>
-        </w:tc>
-      </w:tr>
-      <w:tr>
-        <w:tc>
-          <w:tcPr>
-            <w:tcW w:type="dxa" w:w="1500"/>
-          </w:tcPr>
-          <w:p>
-            <w:pPr>
-              <w:spacing w:before="0" w:after="0" w:line="259" w:lineRule="auto"/>
-              <w:jc w:val="center"/>
-            </w:pPr>
-            <w:r>
-              <w:rPr>
-                <w:rFonts w:ascii="Calibri" w:hAnsi="Calibri" w:eastAsia="Malgun Gothic"/>
-                <w:b w:val="0"/>
-                <w:color w:val="222222"/>
-                <w:sz w:val="18"/>
-              </w:rPr>
-              <w:t>중국어</w:t>
-            </w:r>
-          </w:p>
-        </w:tc>
-        <w:tc>
-          <w:tcPr>
-            <w:tcW w:type="dxa" w:w="6360"/>
-          </w:tcPr>
-          <w:p>
-            <w:pPr>
-              <w:spacing w:before="0" w:after="0" w:line="259" w:lineRule="auto"/>
-              <w:jc w:val="left"/>
-            </w:pPr>
-            <w:r>
-              <w:rPr>
-                <w:rFonts w:ascii="Calibri" w:hAnsi="Calibri" w:eastAsia="Malgun Gothic"/>
-                <w:b w:val="0"/>
-                <w:color w:val="222222"/>
-                <w:sz w:val="18"/>
-              </w:rPr>
-              <w:t>本科申请需要什么材料?</w:t>
-            </w:r>
-          </w:p>
-        </w:tc>
-        <w:tc>
-          <w:tcPr>
-            <w:tcW w:type="dxa" w:w="1500"/>
-          </w:tcPr>
-          <w:p>
-            <w:pPr>
-              <w:spacing w:before="0" w:after="0" w:line="259" w:lineRule="auto"/>
-              <w:jc w:val="center"/>
-            </w:pPr>
-            <w:r>
-              <w:rPr>
-                <w:rFonts w:ascii="Calibri" w:hAnsi="Calibri" w:eastAsia="Malgun Gothic"/>
-                <w:b w:val="0"/>
-                <w:color w:val="222222"/>
-                <w:sz w:val="18"/>
-              </w:rPr>
-              <w:t>PASS</w:t>
-            </w:r>
-          </w:p>
-        </w:tc>
-      </w:tr>
-      <w:tr>
-        <w:tc>
-          <w:tcPr>
-            <w:tcW w:type="dxa" w:w="1500"/>
-          </w:tcPr>
-          <w:p>
-            <w:pPr>
-              <w:spacing w:before="0" w:after="0" w:line="259" w:lineRule="auto"/>
-              <w:jc w:val="center"/>
-            </w:pPr>
-            <w:r>
-              <w:rPr>
-                <w:rFonts w:ascii="Calibri" w:hAnsi="Calibri" w:eastAsia="Malgun Gothic"/>
-                <w:b w:val="0"/>
-                <w:color w:val="222222"/>
-                <w:sz w:val="18"/>
-              </w:rPr>
-              <w:t>베트남어</w:t>
-            </w:r>
-          </w:p>
-        </w:tc>
-        <w:tc>
-          <w:tcPr>
-            <w:tcW w:type="dxa" w:w="6360"/>
-          </w:tcPr>
-          <w:p>
-            <w:pPr>
-              <w:spacing w:before="0" w:after="0" w:line="259" w:lineRule="auto"/>
-              <w:jc w:val="left"/>
-            </w:pPr>
-            <w:r>
-              <w:rPr>
-                <w:rFonts w:ascii="Calibri" w:hAnsi="Calibri" w:eastAsia="Malgun Gothic"/>
-                <w:b w:val="0"/>
-                <w:color w:val="222222"/>
-                <w:sz w:val="18"/>
-              </w:rPr>
-              <w:t>Cần những giấy tờ gì để nộp hồ sơ?</w:t>
-            </w:r>
-          </w:p>
-        </w:tc>
-        <w:tc>
-          <w:tcPr>
-            <w:tcW w:type="dxa" w:w="1500"/>
-          </w:tcPr>
-          <w:p>
-            <w:pPr>
-              <w:spacing w:before="0" w:after="0" w:line="259" w:lineRule="auto"/>
-              <w:jc w:val="center"/>
-            </w:pPr>
-            <w:r>
-              <w:rPr>
-                <w:rFonts w:ascii="Calibri" w:hAnsi="Calibri" w:eastAsia="Malgun Gothic"/>
-                <w:b w:val="0"/>
-                <w:color w:val="222222"/>
-                <w:sz w:val="18"/>
-              </w:rPr>
-              <w:t>PASS</w:t>
-            </w:r>
-          </w:p>
-        </w:tc>
-      </w:tr>
-    </w:tbl>
-    <w:p>
-      <w:pPr>
-        <w:spacing w:before="0" w:after="60"/>
-      </w:pPr>
-    </w:p>
-    <w:p>
-      <w:pPr>
-        <w:pStyle w:val="Heading2"/>
-      </w:pPr>
-      <w:r>
-        <w:t>4.3 실행 검증</w:t>
-      </w:r>
-    </w:p>
-    <w:p>
-      <w:pPr>
-        <w:pStyle w:val="ListBullet"/>
-        <w:ind w:left="720" w:hanging="360"/>
-      </w:pPr>
-      <w:r>
-        <w:t>실제 공식 PDF 6개에서 총 64개 텍스트 청크 생성</w:t>
-      </w:r>
-    </w:p>
-    <w:p>
-      <w:pPr>
-        <w:pStyle w:val="ListBullet"/>
-        <w:ind w:left="720" w:hanging="360"/>
-      </w:pPr>
-      <w:r>
-        <w:t>Persistent Chroma 인덱스에 벡터 64개 저장 확인</w:t>
-      </w:r>
-    </w:p>
-    <w:p>
-      <w:pPr>
-        <w:pStyle w:val="ListBullet"/>
-        <w:ind w:left="720" w:hanging="360"/>
-      </w:pPr>
-      <w:r>
-        <w:t>영어·중국어·베트남어 질의에서 관련 한국어/영어 문서 검색 확인</w:t>
-      </w:r>
-    </w:p>
-    <w:p>
-      <w:pPr>
-        <w:pStyle w:val="ListBullet"/>
-        <w:ind w:left="720" w:hanging="360"/>
-      </w:pPr>
-      <w:r>
-        <w:t>Streamlit 로컬 서버 시작 및 `/_stcore/health` HTTP 200 확인</w:t>
-      </w:r>
-    </w:p>
-    <w:p>
-      <w:pPr>
-        <w:pStyle w:val="ListBullet"/>
-        <w:ind w:left="720" w:hanging="360"/>
-      </w:pPr>
-      <w:r>
-        <w:t>공개 Streamlit URL에서 실제 질문의 답변과 파일명·페이지 출처 표시 확인</w:t>
-      </w:r>
-    </w:p>
-    <w:p>
-      <w:pPr>
-        <w:pStyle w:val="ListBullet"/>
-        <w:ind w:left="720" w:hanging="360"/>
-      </w:pPr>
-      <w:r>
-        <w:t>커밋 대상 파일에서 OpenAI 비밀키 패턴이 없음을 확인</w:t>
-      </w:r>
-    </w:p>
-    <w:p>
-      <w:pPr>
-        <w:pStyle w:val="Heading2"/>
-      </w:pPr>
-      <w:r>
-        <w:t>4.4 평가 한계</w:t>
+        <w:t>7. 배포</w:t>
       </w:r>
     </w:p>
     <w:p>
       <w:r>
-        <w:t>현재 골드 평가 세트는 대표 언어 4개를 빠르게 확인하는 스모크 테스트 수준이다. 향후에는 마감일·등록금·지원자격·서류 예외조건 등 약 15개 이상의 정답 기반 질문으로 확장하고, 검색 정확도와 최종 답변 정확도를 별도로 측정할 필요가 있다.</w:t>
-      </w:r>
-    </w:p>
-    <w:p>
-      <w:pPr>
-        <w:pStyle w:val="Heading1"/>
-      </w:pPr>
-      <w:r>
-        <w:t>5. 배포 및 운영</w:t>
-      </w:r>
-    </w:p>
-    <w:p>
-      <w:pPr>
-        <w:pStyle w:val="Heading2"/>
-      </w:pPr>
-      <w:r>
-        <w:t>5.1 제출·배포 링크</w:t>
+        <w:t>소스 코드는 GitHub의 main 브랜치에 올렸고, Streamlit Community Cloud에서 app.py를 실행하도록 연결했다. Chroma 데이터베이스도 저장소에 포함했기 때문에 배포 서버에서 PDF를 다시 임베딩하지 않아도 된다.</w:t>
       </w:r>
     </w:p>
     <w:tbl>
@@ -3109,7 +1523,7 @@
                 <w:color w:val="203748"/>
                 <w:sz w:val="19"/>
               </w:rPr>
-              <w:t>항목</w:t>
+              <w:t>제출 항목</w:t>
             </w:r>
           </w:p>
         </w:tc>
@@ -3137,7 +1551,49 @@
                 <w:color w:val="203748"/>
                 <w:sz w:val="19"/>
               </w:rPr>
-              <w:t>링크/파일</w:t>
+              <w:t>위치</w:t>
+            </w:r>
+          </w:p>
+        </w:tc>
+      </w:tr>
+      <w:tr>
+        <w:tc>
+          <w:tcPr>
+            <w:tcW w:type="dxa" w:w="2600"/>
+          </w:tcPr>
+          <w:p>
+            <w:pPr>
+              <w:spacing w:before="0" w:after="0" w:line="259" w:lineRule="auto"/>
+              <w:jc w:val="left"/>
+            </w:pPr>
+            <w:r>
+              <w:rPr>
+                <w:rFonts w:ascii="Calibri" w:hAnsi="Calibri" w:eastAsia="Malgun Gothic"/>
+                <w:b w:val="0"/>
+                <w:color w:val="222222"/>
+                <w:sz w:val="18"/>
+              </w:rPr>
+              <w:t>공개 웹 서비스</w:t>
+            </w:r>
+          </w:p>
+        </w:tc>
+        <w:tc>
+          <w:tcPr>
+            <w:tcW w:type="dxa" w:w="6760"/>
+          </w:tcPr>
+          <w:p>
+            <w:pPr>
+              <w:spacing w:before="0" w:after="0" w:line="259" w:lineRule="auto"/>
+              <w:jc w:val="left"/>
+            </w:pPr>
+            <w:r>
+              <w:rPr>
+                <w:rFonts w:ascii="Calibri" w:hAnsi="Calibri" w:eastAsia="Malgun Gothic"/>
+                <w:b w:val="0"/>
+                <w:color w:val="222222"/>
+                <w:sz w:val="18"/>
+              </w:rPr>
+              <w:t>https://ai-bootcamp-rag-7ahkiva6fmc7qzkiifmz6a.streamlit.app/</w:t>
             </w:r>
           </w:p>
         </w:tc>
@@ -3201,48 +1657,6 @@
                 <w:color w:val="222222"/>
                 <w:sz w:val="18"/>
               </w:rPr>
-              <w:t>최종 웹 서비스</w:t>
-            </w:r>
-          </w:p>
-        </w:tc>
-        <w:tc>
-          <w:tcPr>
-            <w:tcW w:type="dxa" w:w="6760"/>
-          </w:tcPr>
-          <w:p>
-            <w:pPr>
-              <w:spacing w:before="0" w:after="0" w:line="259" w:lineRule="auto"/>
-              <w:jc w:val="left"/>
-            </w:pPr>
-            <w:r>
-              <w:rPr>
-                <w:rFonts w:ascii="Calibri" w:hAnsi="Calibri" w:eastAsia="Malgun Gothic"/>
-                <w:b w:val="0"/>
-                <w:color w:val="222222"/>
-                <w:sz w:val="18"/>
-              </w:rPr>
-              <w:t>https://ai-bootcamp-rag-7ahkiva6fmc7qzkiifmz6a.streamlit.app/</w:t>
-            </w:r>
-          </w:p>
-        </w:tc>
-      </w:tr>
-      <w:tr>
-        <w:tc>
-          <w:tcPr>
-            <w:tcW w:type="dxa" w:w="2600"/>
-          </w:tcPr>
-          <w:p>
-            <w:pPr>
-              <w:spacing w:before="0" w:after="0" w:line="259" w:lineRule="auto"/>
-              <w:jc w:val="left"/>
-            </w:pPr>
-            <w:r>
-              <w:rPr>
-                <w:rFonts w:ascii="Calibri" w:hAnsi="Calibri" w:eastAsia="Malgun Gothic"/>
-                <w:b w:val="0"/>
-                <w:color w:val="222222"/>
-                <w:sz w:val="18"/>
-              </w:rPr>
               <w:t>소스 코드 노트북</w:t>
             </w:r>
           </w:p>
@@ -3285,7 +1699,7 @@
                 <w:color w:val="222222"/>
                 <w:sz w:val="18"/>
               </w:rPr>
-              <w:t>프로젝트 결과보고서</w:t>
+              <w:t>결과보고서</w:t>
             </w:r>
           </w:p>
         </w:tc>
@@ -3318,86 +1732,10 @@
     </w:p>
     <w:p>
       <w:pPr>
-        <w:pStyle w:val="Heading2"/>
-      </w:pPr>
-      <w:r>
-        <w:t>5.2 배포 구성</w:t>
-      </w:r>
-    </w:p>
-    <w:p>
-      <w:pPr>
-        <w:pStyle w:val="ListNumber"/>
-        <w:ind w:left="720" w:hanging="360"/>
-      </w:pPr>
-      <w:r>
-        <w:rPr>
-          <w:rFonts w:ascii="Calibri" w:hAnsi="Calibri" w:eastAsia="Malgun Gothic"/>
-          <w:b/>
-          <w:color w:val="1F4D78"/>
-        </w:rPr>
-        <w:t xml:space="preserve">Repository: </w:t>
-      </w:r>
-      <w:r>
-        <w:t>소스 코드와 persistent `chroma_db/`를 GitHub `main` 브랜치에 저장한다.</w:t>
-      </w:r>
-    </w:p>
-    <w:p>
-      <w:pPr>
-        <w:pStyle w:val="ListNumber"/>
-        <w:ind w:left="720" w:hanging="360"/>
-      </w:pPr>
-      <w:r>
-        <w:rPr>
-          <w:rFonts w:ascii="Calibri" w:hAnsi="Calibri" w:eastAsia="Malgun Gothic"/>
-          <w:b/>
-          <w:color w:val="1F4D78"/>
-        </w:rPr>
-        <w:t xml:space="preserve">Entry point: </w:t>
-      </w:r>
-      <w:r>
-        <w:t>Streamlit Community Cloud의 실행 파일을 `app.py`로 지정한다.</w:t>
-      </w:r>
-    </w:p>
-    <w:p>
-      <w:pPr>
-        <w:pStyle w:val="ListNumber"/>
-        <w:ind w:left="720" w:hanging="360"/>
-      </w:pPr>
-      <w:r>
-        <w:rPr>
-          <w:rFonts w:ascii="Calibri" w:hAnsi="Calibri" w:eastAsia="Malgun Gothic"/>
-          <w:b/>
-          <w:color w:val="1F4D78"/>
-        </w:rPr>
-        <w:t xml:space="preserve">Secrets: </w:t>
-      </w:r>
-      <w:r>
-        <w:t>OpenAI 키는 저장소가 아닌 Streamlit Secrets의 `OPENAI_API_KEY`에 저장한다.</w:t>
-      </w:r>
-    </w:p>
-    <w:p>
-      <w:pPr>
-        <w:pStyle w:val="ListNumber"/>
-        <w:ind w:left="720" w:hanging="360"/>
-      </w:pPr>
-      <w:r>
-        <w:rPr>
-          <w:rFonts w:ascii="Calibri" w:hAnsi="Calibri" w:eastAsia="Malgun Gothic"/>
-          <w:b/>
-          <w:color w:val="1F4D78"/>
-        </w:rPr>
-        <w:t xml:space="preserve">Operation: </w:t>
-      </w:r>
-      <w:r>
-        <w:t>GitHub에 새 커밋이 푸시되면 Streamlit 앱이 자동으로 재배포된다.</w:t>
-      </w:r>
-    </w:p>
-    <w:p>
-      <w:pPr>
         <w:pStyle w:val="Heading1"/>
       </w:pPr>
       <w:r>
-        <w:t>6. 한계 및 개선 방향</w:t>
+        <w:t>8. 아쉬운 점과 앞으로 해 보고 싶은 것</w:t>
       </w:r>
     </w:p>
     <w:p>
@@ -3406,7 +1744,7 @@
         <w:ind w:left="720" w:hanging="360"/>
       </w:pPr>
       <w:r>
-        <w:t>스크린샷 중심 페이지의 OCR은 v1 범위에서 제외되어 이미지 내부 텍스트를 검색하지 못한다.</w:t>
+        <w:t>이미지로 된 안내 화면도 검색할 수 있도록 OCR을 추가하고 싶다.</w:t>
       </w:r>
     </w:p>
     <w:p>
@@ -3415,7 +1753,7 @@
         <w:ind w:left="720" w:hanging="360"/>
       </w:pPr>
       <w:r>
-        <w:t>PDF가 갱신되면 수동 ingest가 필요하므로 향후 자동 문서 동기화 파이프라인이 필요하다.</w:t>
+        <w:t>질문이 학부인지 대학원인지 먼저 선택하게 하면 서로 다른 과정의 출처가 섞이는 일을 줄일 수 있다.</w:t>
       </w:r>
     </w:p>
     <w:p>
@@ -3424,7 +1762,7 @@
         <w:ind w:left="720" w:hanging="360"/>
       </w:pPr>
       <w:r>
-        <w:t>현재 모델 답변은 정보 안내 목적이며 중요한 일정과 자격요건은 입학처 재확인이 필요하다.</w:t>
+        <w:t>입학 공지가 바뀔 때 자동으로 문서를 다시 수집하고 인덱스를 갱신하는 기능이 필요하다.</w:t>
       </w:r>
     </w:p>
     <w:p>
@@ -3433,7 +1771,7 @@
         <w:ind w:left="720" w:hanging="360"/>
       </w:pPr>
       <w:r>
-        <w:t>향후 검색 점수 임계값, reranker, 사용자 피드백을 추가하면 근거 적합도를 높일 수 있다.</w:t>
+        <w:t>실제 외국인 지원자에게 사용해 보게 하고 어려웠던 표현이나 빠진 질문을 수집하고 싶다.</w:t>
       </w:r>
     </w:p>
     <w:p>
@@ -3441,12 +1779,17 @@
         <w:pStyle w:val="Heading1"/>
       </w:pPr>
       <w:r>
-        <w:t>7. 결론</w:t>
+        <w:t>9. 느낀 점</w:t>
       </w:r>
     </w:p>
     <w:p>
       <w:r>
-        <w:t>본 프로젝트는 단순한 1:1 번역기를 넘어, 서로 다른 언어로 작성된 공식 문서를 하나의 검색 가능한 지식베이스로 통합하고 지원자의 상황에 맞는 답변과 체크리스트를 제공한다. LangChain, Chroma VectorDB, 다국어 임베딩, LLM, Streamlit을 실제 서비스 흐름으로 연결했으며, 출처 표시와 답변 거절 정책으로 입학 정보 서비스에 필요한 신뢰성을 강화했다.</w:t>
+        <w:t>이번 프로젝트를 하면서 RAG는 단순히 PDF를 넣고 질문하는 기능이 아니라는 것을 알게 되었다. 텍스트를 어떻게 나누는지, 출처 정보를 어떻게 남기는지, 검색 결과가 없을 때 어떻게 처리하는지가 최종 답변의 신뢰도에 직접 영향을 줬다.</w:t>
+      </w:r>
+    </w:p>
+    <w:p>
+      <w:r>
+        <w:t>또한 다국어 서비스에서는 번역 품질만큼 사용자가 원문을 확인할 수 있게 하는 것이 중요했다. 현재 기능은 작은 규모이지만, 학교에 처음 지원하는 학생이 여러 PDF를 반복해서 찾는 시간을 줄여 줄 수 있다는 점에서 실제 사용 목적이 분명한 결과물을 만들었다고 생각한다.</w:t>
       </w:r>
     </w:p>
     <w:p>

</xml_diff>